<commit_message>
Integreaza metoda de lucru: macerate de plante si stropire minima
Ambele documente:
- pozitionarea include acum metoda ca pilon distinct: stropiri reduse la
  minimul necesar, macerate de plante preparate in crama, fara insecticide,
  erbicide sau ingrasaminte de sinteza, cu pierderi de productie asumate
- mesaj-semnatura: "Ne doare pe noi capul, ca sa nu fie nevoie de scurtaturi"
- sectiunile legale acopera acum interdictia mentiunilor de sanatate pe
  bauturi cu peste 1,2% alcool, inclusiv formularile indirecte

Facebook: postare noua dedicata metodei (13 postari), calendar refacut
TikTok: scenariu nou despre prepararea si aplicarea maceratelor (13 clipuri),
calendar extins, regula de filmare privind mentiunile de sanatate

Numerotarea postarilor si a scenariilor se calculeaza acum din pozitie,
ca inserarile ulterioare sa nu produca inconsistente.

Co-Authored-By: Claude Opus 5 <noreply@anthropic.com>
Claude-Session: https://claude.ai/code/session_01X5Qt8vucPGTZm8gyqCrjhz
</commit_message>
<xml_diff>
--- a/Postari-Facebook-Cramele-Odobesti.docx
+++ b/Postari-Facebook-Cramele-Odobesti.docx
@@ -65,7 +65,7 @@
           <w:sz w:val="22"/>
           <w:szCs w:val="22"/>
         </w:rPr>
-        <w:t xml:space="preserve">Douăsprezece postări scrise pe gamele reale ale casei — Occultus, Secolul 13, Omnia, Monșer, Suav, Senator Private Collection, Glia și Hereditas — împreună cu un calendar de publicare, indicații de producție pentru fiecare vizual și indicatorii după care se măsoară rezultatul.</w:t>
+        <w:t xml:space="preserve">Treisprezece postări scrise pe gamele reale ale casei — Occultus, Secolul 13, Omnia, Monșer, Suav, Senator Private Collection, Glia și Hereditas — împreună cu un calendar de publicare, indicații de producție pentru fiecare vizual și indicatorii după care se măsoară rezultatul.</w:t>
       </w:r>
     </w:p>
     <w:p>
@@ -99,7 +99,7 @@
           <w:sz w:val="21"/>
           <w:szCs w:val="21"/>
         </w:rPr>
-        <w:t xml:space="preserve">Cramele Odobești au trei avantaje pe care aproape nicio altă cramă din România nu le poate revendica simultan.</w:t>
+        <w:t xml:space="preserve">Cramele Odobești au patru avantaje pe care aproape nicio altă cramă din România nu le poate revendica simultan.</w:t>
       </w:r>
     </w:p>
     <w:p>
@@ -129,7 +129,7 @@
           <w:sz w:val="21"/>
           <w:szCs w:val="21"/>
         </w:rPr>
-        <w:t xml:space="preserve">via a fost convertită în sistem ecologic în 2010, iar crama a fost printre primii producători din România care au făcut-o pe suprafețe de peste 15 hectare. Este singura afirmație din tot pachetul pe care un concurent nu o poate copia: un an și o suprafață nu se pot inventa retroactiv.</w:t>
+        <w:t xml:space="preserve">via a fost convertită în sistem ecologic în 2010, iar crama a fost printre primii producători din România care au făcut-o pe suprafețe de peste 15 hectare. Un an și o suprafață nu se pot inventa retroactiv — este afirmația pe care un concurent nu o poate copia niciodată.</w:t>
       </w:r>
     </w:p>
     <w:p>
@@ -150,7 +150,7 @@
           <w:sz w:val="21"/>
           <w:szCs w:val="21"/>
         </w:rPr>
-        <w:t xml:space="preserve">Amploarea. </w:t>
+        <w:t xml:space="preserve">Metoda. </w:t>
       </w:r>
       <w:r>
         <w:rPr>
@@ -159,7 +159,7 @@
           <w:sz w:val="21"/>
           <w:szCs w:val="21"/>
         </w:rPr>
-        <w:t xml:space="preserve">peste douăzeci de soiuri lucrate ecologic, cel mai mare număr din țară.</w:t>
+        <w:t xml:space="preserve">stropiri reduse la minimul necesar, cu macerate de plante preparate în cramă. Fără insecticide, fără erbicide, fără îngrășăminte de sinteză — cu pierderi de producție asumate în fiecare an.</w:t>
       </w:r>
     </w:p>
     <w:p>
@@ -180,7 +180,7 @@
           <w:sz w:val="21"/>
           <w:szCs w:val="21"/>
         </w:rPr>
-        <w:t xml:space="preserve">Soiurile rare. </w:t>
+        <w:t xml:space="preserve">Amploarea. </w:t>
       </w:r>
       <w:r>
         <w:rPr>
@@ -189,75 +189,7 @@
           <w:sz w:val="21"/>
           <w:szCs w:val="21"/>
         </w:rPr>
-        <w:t xml:space="preserve">Zghihara, Băbească Gri, Crâmpoșie, Cadarcă — soiuri românești pe care majoritatea podgoriilor le-au abandonat.</w:t>
-      </w:r>
-    </w:p>
-    <w:p>
-      <w:pPr>
-        <w:spacing w:after="130" w:before="160"/>
-      </w:pPr>
-      <w:r>
-        <w:rPr>
-          <w:rFonts w:ascii="Calibri" w:cs="Calibri" w:eastAsia="Calibri" w:hAnsi="Calibri"/>
-          <w:color w:val="262626"/>
-          <w:sz w:val="21"/>
-          <w:szCs w:val="21"/>
-        </w:rPr>
-        <w:t xml:space="preserve">Toate postările din acest document sunt construite pe aceste trei avantaje. Nu vindem „vin bun" — asta spune toată lumea și nu se poate verifica. Vindem cincisprezece ani de lucru ecologic aplicați celor mai puțin obișnuite soiuri românești.</w:t>
-      </w:r>
-    </w:p>
-    <w:p>
-      <w:pPr>
-        <w:pBdr>
-          <w:left w:val="single" w:color="9A7B27" w:sz="10" w:space="10"/>
-        </w:pBdr>
-        <w:spacing w:after="140" w:before="120" w:line="276"/>
-        <w:ind w:left="200"/>
-      </w:pPr>
-      <w:r>
-        <w:rPr>
-          <w:rFonts w:ascii="Calibri" w:cs="Calibri" w:eastAsia="Calibri" w:hAnsi="Calibri"/>
-          <w:i/>
-          <w:iCs/>
-          <w:color w:val="6E6E6E"/>
-          <w:sz w:val="19"/>
-          <w:szCs w:val="19"/>
-        </w:rPr>
-        <w:t xml:space="preserve">Formularea „printre primii din România care au lucrat ecologic suprafețe de peste 15 hectare" este prudentă și susținută. Evitați „primii din țară" dacă nu o puteți proba cu documente — o afirmație contestată public costă mai mult decât aduce.</w:t>
-      </w:r>
-    </w:p>
-    <w:p>
-      <w:pPr>
-        <w:pStyle w:val="Heading1"/>
-        <w:pBdr>
-          <w:bottom w:val="single" w:color="5E1026" w:sz="8" w:space="8"/>
-        </w:pBdr>
-        <w:spacing w:after="200" w:before="380"/>
-      </w:pPr>
-      <w:r>
-        <w:rPr>
-          <w:rFonts w:ascii="Georgia" w:cs="Georgia" w:eastAsia="Georgia" w:hAnsi="Georgia"/>
-          <w:b/>
-          <w:bCs/>
-          <w:color w:val="5E1026"/>
-          <w:sz w:val="30"/>
-          <w:szCs w:val="30"/>
-        </w:rPr>
-        <w:t xml:space="preserve">Ton și voce</w:t>
-      </w:r>
-    </w:p>
-    <w:p>
-      <w:pPr>
-        <w:spacing w:after="130" w:line="288"/>
-      </w:pPr>
-      <w:r>
-        <w:rPr>
-          <w:rFonts w:ascii="Calibri" w:cs="Calibri" w:eastAsia="Calibri" w:hAnsi="Calibri"/>
-          <w:color w:val="262626"/>
-          <w:sz w:val="21"/>
-          <w:szCs w:val="21"/>
-        </w:rPr>
-        <w:t xml:space="preserve">Un brand de vin nu strigă. Regulile de mai jos sunt aplicate deja în textele din acest document; păstrați-le și când scrieți postări noi.</w:t>
+        <w:t xml:space="preserve">peste douăzeci de soiuri lucrate ecologic, cel mai mare număr din țară.</w:t>
       </w:r>
     </w:p>
     <w:p>
@@ -272,11 +204,141 @@
       <w:r>
         <w:rPr>
           <w:rFonts w:ascii="Calibri" w:cs="Calibri" w:eastAsia="Calibri" w:hAnsi="Calibri"/>
+          <w:b/>
+          <w:bCs/>
+          <w:color w:val="5E1026"/>
+          <w:sz w:val="21"/>
+          <w:szCs w:val="21"/>
+        </w:rPr>
+        <w:t xml:space="preserve">Soiurile rare. </w:t>
+      </w:r>
+      <w:r>
+        <w:rPr>
+          <w:rFonts w:ascii="Calibri" w:cs="Calibri" w:eastAsia="Calibri" w:hAnsi="Calibri"/>
           <w:color w:val="262626"/>
           <w:sz w:val="21"/>
           <w:szCs w:val="21"/>
         </w:rPr>
-        <w:t xml:space="preserve">Fraze scurte. O idee pe rând. Textele lungi se citesc pe diagonală, iar pe diagonală nu se cumpără.</w:t>
+        <w:t xml:space="preserve">Zghihara, Băbească Gri, Crâmpoșie, Cadarcă — soiuri românești pe care majoritatea podgoriilor le-au abandonat.</w:t>
+      </w:r>
+    </w:p>
+    <w:p>
+      <w:pPr>
+        <w:spacing w:after="130" w:before="160"/>
+      </w:pPr>
+      <w:r>
+        <w:rPr>
+          <w:rFonts w:ascii="Calibri" w:cs="Calibri" w:eastAsia="Calibri" w:hAnsi="Calibri"/>
+          <w:color w:val="262626"/>
+          <w:sz w:val="21"/>
+          <w:szCs w:val="21"/>
+        </w:rPr>
+        <w:t xml:space="preserve">Toate postările din acest document sunt construite pe aceste patru avantaje. Nu vindem „vin bun" — asta spune toată lumea și nu se poate verifica. Vindem cincisprezece ani de lucru ecologic, o metodă care costă producție în fiecare an, aplicate celor mai puțin obișnuite soiuri românești.</w:t>
+      </w:r>
+    </w:p>
+    <w:p>
+      <w:pPr>
+        <w:spacing w:after="70" w:before="200"/>
+      </w:pPr>
+      <w:r>
+        <w:rPr>
+          <w:rFonts w:ascii="Calibri" w:cs="Calibri" w:eastAsia="Calibri" w:hAnsi="Calibri"/>
+          <w:b/>
+          <w:bCs/>
+          <w:color w:val="9A7B27"/>
+          <w:spacing w:val="30"/>
+          <w:sz w:val="16"/>
+          <w:szCs w:val="16"/>
+        </w:rPr>
+        <w:t xml:space="preserve">MESAJUL-SEMNĂTURĂ</w:t>
+      </w:r>
+    </w:p>
+    <w:p>
+      <w:pPr>
+        <w:spacing w:after="130" w:line="288"/>
+      </w:pPr>
+      <w:r>
+        <w:rPr>
+          <w:rFonts w:ascii="Calibri" w:cs="Calibri" w:eastAsia="Calibri" w:hAnsi="Calibri"/>
+          <w:color w:val="262626"/>
+          <w:sz w:val="22"/>
+          <w:szCs w:val="22"/>
+        </w:rPr>
+        <w:t xml:space="preserve">„Ne doare pe noi capul, ca să nu fie nevoie de scurtături." Este cea mai bună frază pe care o are crama, pentru că spune efortul fără să se laude cu el. Poate fi folosită ca titlu de postare, ca text pe imagine sau ca răspuns la întrebarea „de ce costă mai mult".</w:t>
+      </w:r>
+    </w:p>
+    <w:p>
+      <w:pPr>
+        <w:pBdr>
+          <w:left w:val="single" w:color="9A7B27" w:sz="10" w:space="10"/>
+        </w:pBdr>
+        <w:spacing w:after="140" w:before="120" w:line="276"/>
+        <w:ind w:left="200"/>
+      </w:pPr>
+      <w:r>
+        <w:rPr>
+          <w:rFonts w:ascii="Calibri" w:cs="Calibri" w:eastAsia="Calibri" w:hAnsi="Calibri"/>
+          <w:i/>
+          <w:iCs/>
+          <w:color w:val="6E6E6E"/>
+          <w:sz w:val="19"/>
+          <w:szCs w:val="19"/>
+        </w:rPr>
+        <w:t xml:space="preserve">Fraza funcționează atâta timp cât rămâne despre efortul vostru. În momentul în care devine o promisiune despre ce simte cel care bea — „nu te doare capul de la vinul nostru" — se transformă într-o mențiune de sănătate, iar acestea sunt interzise prin lege pe băuturile cu peste 1,2% alcool. Detalii în secțiunea de obligații legale, la finalul documentului.</w:t>
+      </w:r>
+    </w:p>
+    <w:p>
+      <w:pPr>
+        <w:pBdr>
+          <w:left w:val="single" w:color="9A7B27" w:sz="10" w:space="10"/>
+        </w:pBdr>
+        <w:spacing w:after="140" w:before="120" w:line="276"/>
+        <w:ind w:left="200"/>
+      </w:pPr>
+      <w:r>
+        <w:rPr>
+          <w:rFonts w:ascii="Calibri" w:cs="Calibri" w:eastAsia="Calibri" w:hAnsi="Calibri"/>
+          <w:i/>
+          <w:iCs/>
+          <w:color w:val="6E6E6E"/>
+          <w:sz w:val="19"/>
+          <w:szCs w:val="19"/>
+        </w:rPr>
+        <w:t xml:space="preserve">Formularea „printre primii din România care au lucrat ecologic suprafețe de peste 15 hectare" este prudentă și susținută. Evitați „primii din țară" dacă nu o puteți proba cu documente — o afirmație contestată public costă mai mult decât aduce.</w:t>
+      </w:r>
+    </w:p>
+    <w:p>
+      <w:pPr>
+        <w:pStyle w:val="Heading1"/>
+        <w:pBdr>
+          <w:bottom w:val="single" w:color="5E1026" w:sz="8" w:space="8"/>
+        </w:pBdr>
+        <w:spacing w:after="200" w:before="380"/>
+      </w:pPr>
+      <w:r>
+        <w:rPr>
+          <w:rFonts w:ascii="Georgia" w:cs="Georgia" w:eastAsia="Georgia" w:hAnsi="Georgia"/>
+          <w:b/>
+          <w:bCs/>
+          <w:color w:val="5E1026"/>
+          <w:sz w:val="30"/>
+          <w:szCs w:val="30"/>
+        </w:rPr>
+        <w:t xml:space="preserve">Ton și voce</w:t>
+      </w:r>
+    </w:p>
+    <w:p>
+      <w:pPr>
+        <w:spacing w:after="130" w:line="288"/>
+      </w:pPr>
+      <w:r>
+        <w:rPr>
+          <w:rFonts w:ascii="Calibri" w:cs="Calibri" w:eastAsia="Calibri" w:hAnsi="Calibri"/>
+          <w:color w:val="262626"/>
+          <w:sz w:val="21"/>
+          <w:szCs w:val="21"/>
+        </w:rPr>
+        <w:t xml:space="preserve">Un brand de vin nu strigă. Regulile de mai jos sunt aplicate deja în textele din acest document; păstrați-le și când scrieți postări noi.</w:t>
       </w:r>
     </w:p>
     <w:p>
@@ -295,7 +357,7 @@
           <w:sz w:val="21"/>
           <w:szCs w:val="21"/>
         </w:rPr>
-        <w:t xml:space="preserve">Maximum două emoji pe postare, și numai unde chiar ajută. Emoji-urile în exces coboară percepția de preț.</w:t>
+        <w:t xml:space="preserve">Fraze scurte. O idee pe rând. Textele lungi se citesc pe diagonală, iar pe diagonală nu se cumpără.</w:t>
       </w:r>
     </w:p>
     <w:p>
@@ -314,7 +376,7 @@
           <w:sz w:val="21"/>
           <w:szCs w:val="21"/>
         </w:rPr>
-        <w:t xml:space="preserve">Fără superlative goale: „excepțional", „de neuitat", „cel mai bun". Spuneți fapte — soiul, procedeul, numărul de sticle — și lăsați concluzia cititorului.</w:t>
+        <w:t xml:space="preserve">Maximum două emoji pe postare, și numai unde chiar ajută. Emoji-urile în exces coboară percepția de preț.</w:t>
       </w:r>
     </w:p>
     <w:p>
@@ -333,7 +395,7 @@
           <w:sz w:val="21"/>
           <w:szCs w:val="21"/>
         </w:rPr>
-        <w:t xml:space="preserve">Adresare cu „dumneavoastră" în postările premium și B2B, „tu" în cele cotidiene. Amestecul se simte.</w:t>
+        <w:t xml:space="preserve">Fără superlative goale: „excepțional", „de neuitat", „cel mai bun". Spuneți fapte — soiul, procedeul, numărul de sticle — și lăsați concluzia cititorului.</w:t>
       </w:r>
     </w:p>
     <w:p>
@@ -352,46 +414,7 @@
           <w:sz w:val="21"/>
           <w:szCs w:val="21"/>
         </w:rPr>
-        <w:t xml:space="preserve">Fiecare postare comercială se termină cu un singur îndemn și un singur link. Două îndemnuri înseamnă zero.</w:t>
-      </w:r>
-    </w:p>
-    <w:p>
-      <w:r>
-        <w:br w:type="page"/>
-      </w:r>
-    </w:p>
-    <w:p>
-      <w:pPr>
-        <w:pStyle w:val="Heading1"/>
-        <w:pBdr>
-          <w:bottom w:val="single" w:color="5E1026" w:sz="8" w:space="8"/>
-        </w:pBdr>
-        <w:spacing w:after="200" w:before="380"/>
-      </w:pPr>
-      <w:r>
-        <w:rPr>
-          <w:rFonts w:ascii="Georgia" w:cs="Georgia" w:eastAsia="Georgia" w:hAnsi="Georgia"/>
-          <w:b/>
-          <w:bCs/>
-          <w:color w:val="5E1026"/>
-          <w:sz w:val="30"/>
-          <w:szCs w:val="30"/>
-        </w:rPr>
-        <w:t xml:space="preserve">Ce trebuie completat înainte de publicare</w:t>
-      </w:r>
-    </w:p>
-    <w:p>
-      <w:pPr>
-        <w:spacing w:after="130" w:line="288"/>
-      </w:pPr>
-      <w:r>
-        <w:rPr>
-          <w:rFonts w:ascii="Calibri" w:cs="Calibri" w:eastAsia="Calibri" w:hAnsi="Calibri"/>
-          <w:color w:val="262626"/>
-          <w:sz w:val="21"/>
-          <w:szCs w:val="21"/>
-        </w:rPr>
-        <w:t xml:space="preserve">Textele conțin locuri marcate între paranteze drepte. Ele trebuie înlocuite cu datele reale ale cramei. Nu am inventat prețuri, tiraje, ani de recoltă sau recenzii: o cifră greșită publicată pe pagină costă mai mult decât aduce postarea.</w:t>
+        <w:t xml:space="preserve">Adresare cu „dumneavoastră" în postările premium și B2B, „tu" în cele cotidiene. Amestecul se simte.</w:t>
       </w:r>
     </w:p>
     <w:p>
@@ -406,22 +429,50 @@
       <w:r>
         <w:rPr>
           <w:rFonts w:ascii="Calibri" w:cs="Calibri" w:eastAsia="Calibri" w:hAnsi="Calibri"/>
-          <w:b/>
-          <w:bCs/>
-          <w:color w:val="5E1026"/>
-          <w:sz w:val="21"/>
-          <w:szCs w:val="21"/>
-        </w:rPr>
-        <w:t xml:space="preserve">[LINK_COMANDĂ] </w:t>
-      </w:r>
-      <w:r>
-        <w:rPr>
-          <w:rFonts w:ascii="Calibri" w:cs="Calibri" w:eastAsia="Calibri" w:hAnsi="Calibri"/>
           <w:color w:val="262626"/>
           <w:sz w:val="21"/>
           <w:szCs w:val="21"/>
         </w:rPr>
-        <w:t xml:space="preserve">adresa magazinului online. Folosiți un link cu etichetă de urmărire, ca să știți exact ce a vândut fiecare postare.</w:t>
+        <w:t xml:space="preserve">Fiecare postare comercială se termină cu un singur îndemn și un singur link. Două îndemnuri înseamnă zero.</w:t>
+      </w:r>
+    </w:p>
+    <w:p>
+      <w:r>
+        <w:br w:type="page"/>
+      </w:r>
+    </w:p>
+    <w:p>
+      <w:pPr>
+        <w:pStyle w:val="Heading1"/>
+        <w:pBdr>
+          <w:bottom w:val="single" w:color="5E1026" w:sz="8" w:space="8"/>
+        </w:pBdr>
+        <w:spacing w:after="200" w:before="380"/>
+      </w:pPr>
+      <w:r>
+        <w:rPr>
+          <w:rFonts w:ascii="Georgia" w:cs="Georgia" w:eastAsia="Georgia" w:hAnsi="Georgia"/>
+          <w:b/>
+          <w:bCs/>
+          <w:color w:val="5E1026"/>
+          <w:sz w:val="30"/>
+          <w:szCs w:val="30"/>
+        </w:rPr>
+        <w:t xml:space="preserve">Ce trebuie completat înainte de publicare</w:t>
+      </w:r>
+    </w:p>
+    <w:p>
+      <w:pPr>
+        <w:spacing w:after="130" w:line="288"/>
+      </w:pPr>
+      <w:r>
+        <w:rPr>
+          <w:rFonts w:ascii="Calibri" w:cs="Calibri" w:eastAsia="Calibri" w:hAnsi="Calibri"/>
+          <w:color w:val="262626"/>
+          <w:sz w:val="21"/>
+          <w:szCs w:val="21"/>
+        </w:rPr>
+        <w:t xml:space="preserve">Textele conțin locuri marcate între paranteze drepte. Ele trebuie înlocuite cu datele reale ale cramei. Nu am inventat prețuri, tiraje, ani de recoltă sau recenzii: o cifră greșită publicată pe pagină costă mai mult decât aduce postarea.</w:t>
       </w:r>
     </w:p>
     <w:p>
@@ -442,7 +493,7 @@
           <w:sz w:val="21"/>
           <w:szCs w:val="21"/>
         </w:rPr>
-        <w:t xml:space="preserve">[TELEFON], [EMAIL] </w:t>
+        <w:t xml:space="preserve">[LINK_COMANDĂ] </w:t>
       </w:r>
       <w:r>
         <w:rPr>
@@ -451,7 +502,7 @@
           <w:sz w:val="21"/>
           <w:szCs w:val="21"/>
         </w:rPr>
-        <w:t xml:space="preserve">datele de contact pentru comenzi și pentru partenerii B2B.</w:t>
+        <w:t xml:space="preserve">adresa magazinului online. Folosiți un link cu etichetă de urmărire, ca să știți exact ce a vândut fiecare postare.</w:t>
       </w:r>
     </w:p>
     <w:p>
@@ -472,7 +523,7 @@
           <w:sz w:val="21"/>
           <w:szCs w:val="21"/>
         </w:rPr>
-        <w:t xml:space="preserve">[PREȚ], [DATA] </w:t>
+        <w:t xml:space="preserve">[TELEFON], [EMAIL] </w:t>
       </w:r>
       <w:r>
         <w:rPr>
@@ -481,7 +532,7 @@
           <w:sz w:val="21"/>
           <w:szCs w:val="21"/>
         </w:rPr>
-        <w:t xml:space="preserve">prețul pachetului și termenul ofertei.</w:t>
+        <w:t xml:space="preserve">datele de contact pentru comenzi și pentru partenerii B2B.</w:t>
       </w:r>
     </w:p>
     <w:p>
@@ -502,7 +553,7 @@
           <w:sz w:val="21"/>
           <w:szCs w:val="21"/>
         </w:rPr>
-        <w:t xml:space="preserve">[NUMĂR] </w:t>
+        <w:t xml:space="preserve">[PREȚ], [DATA] </w:t>
       </w:r>
       <w:r>
         <w:rPr>
@@ -511,7 +562,7 @@
           <w:sz w:val="21"/>
           <w:szCs w:val="21"/>
         </w:rPr>
-        <w:t xml:space="preserve">tirajul ediției limitate Occultus aflate efectiv în stoc.</w:t>
+        <w:t xml:space="preserve">prețul pachetului și termenul ofertei.</w:t>
       </w:r>
     </w:p>
     <w:p>
@@ -532,7 +583,7 @@
           <w:sz w:val="21"/>
           <w:szCs w:val="21"/>
         </w:rPr>
-        <w:t xml:space="preserve">[AN] </w:t>
+        <w:t xml:space="preserve">[NUMĂR] </w:t>
       </w:r>
       <w:r>
         <w:rPr>
@@ -541,7 +592,7 @@
           <w:sz w:val="21"/>
           <w:szCs w:val="21"/>
         </w:rPr>
-        <w:t xml:space="preserve">recolta la vânzare în momentul publicării.</w:t>
+        <w:t xml:space="preserve">tirajul ediției limitate Occultus aflate efectiv în stoc.</w:t>
       </w:r>
     </w:p>
     <w:p>
@@ -562,6 +613,36 @@
           <w:sz w:val="21"/>
           <w:szCs w:val="21"/>
         </w:rPr>
+        <w:t xml:space="preserve">[AN] </w:t>
+      </w:r>
+      <w:r>
+        <w:rPr>
+          <w:rFonts w:ascii="Calibri" w:cs="Calibri" w:eastAsia="Calibri" w:hAnsi="Calibri"/>
+          <w:color w:val="262626"/>
+          <w:sz w:val="21"/>
+          <w:szCs w:val="21"/>
+        </w:rPr>
+        <w:t xml:space="preserve">recolta la vânzare în momentul publicării.</w:t>
+      </w:r>
+    </w:p>
+    <w:p>
+      <w:pPr>
+        <w:pStyle w:val="ListParagraph"/>
+        <w:numPr>
+          <w:ilvl w:val="0"/>
+          <w:numId w:val="2"/>
+        </w:numPr>
+        <w:spacing w:after="90" w:line="276"/>
+      </w:pPr>
+      <w:r>
+        <w:rPr>
+          <w:rFonts w:ascii="Calibri" w:cs="Calibri" w:eastAsia="Calibri" w:hAnsi="Calibri"/>
+          <w:b/>
+          <w:bCs/>
+          <w:color w:val="5E1026"/>
+          <w:sz w:val="21"/>
+          <w:szCs w:val="21"/>
+        </w:rPr>
         <w:t xml:space="preserve">[SOI 1–6] </w:t>
       </w:r>
       <w:r>
@@ -616,7 +697,7 @@
           <w:sz w:val="30"/>
           <w:szCs w:val="30"/>
         </w:rPr>
-        <w:t xml:space="preserve">Cele douăsprezece postări</w:t>
+        <w:t xml:space="preserve">Cele treisprezece postări</w:t>
       </w:r>
     </w:p>
     <w:p>
@@ -1861,7 +1942,7 @@
           <w:sz w:val="25"/>
           <w:szCs w:val="25"/>
         </w:rPr>
-        <w:t xml:space="preserve">4. Omnia — povestea numelui</w:t>
+        <w:t xml:space="preserve">4. Ne doare pe noi capul</w:t>
       </w:r>
       <w:r>
         <w:rPr>
@@ -1872,7 +1953,7 @@
           <w:sz w:val="18"/>
           <w:szCs w:val="18"/>
         </w:rPr>
-        <w:t xml:space="preserve">   · gama Omnia</w:t>
+        <w:t xml:space="preserve">   · metoda de lucru · mesajul-semnătură al cramei</w:t>
       </w:r>
     </w:p>
     <w:p>
@@ -1897,7 +1978,7 @@
           <w:sz w:val="19"/>
           <w:szCs w:val="19"/>
         </w:rPr>
-        <w:t xml:space="preserve">Să dea profunzime unei game ecologice de volum, prin narativ.</w:t>
+        <w:t xml:space="preserve">Să explice de ce vinul costă cât costă, prin efortul asumat — nu prin adjective. Cea mai memorabilă postare din pachet.</w:t>
       </w:r>
     </w:p>
     <w:p>
@@ -1955,7 +2036,7 @@
                 <w:sz w:val="21"/>
                 <w:szCs w:val="21"/>
               </w:rPr>
-              <w:t xml:space="preserve">„Omnia mea mecum porto." Tot ce am, port cu mine.</w:t>
+              <w:t xml:space="preserve">Ne doare capul tot anul, ca să nu fie nevoie de scurtături.</w:t>
             </w:r>
           </w:p>
           <w:p>
@@ -1983,7 +2064,7 @@
                 <w:sz w:val="21"/>
                 <w:szCs w:val="21"/>
               </w:rPr>
-              <w:t xml:space="preserve">Latinescul din care vine numele gamei Omnia spune ceva simplu: important e ce rămâne cu tine, nu ce ai adunat. Am pornit gama în 2010, cu trei soiuri românești — Fetească Albă, Fetească Neagră, Băbească Neagră. Apoi am adăugat Riesling Italian, Chardonnay, Cabernet Sauvignon.</w:t>
+              <w:t xml:space="preserve">Stropim minimul necesar. Nu preventiv, nu după calendar, nu „ca să fim siguri" — ci doar atunci când via chiar are nevoie. În rest, folosim macerate de plante, pe care ni le preparăm singuri.</w:t>
             </w:r>
           </w:p>
           <w:p>
@@ -2011,7 +2092,7 @@
                 <w:sz w:val="21"/>
                 <w:szCs w:val="21"/>
               </w:rPr>
-              <w:t xml:space="preserve">Toate, lucrate ecologic. Toate, gândite pentru mesele obișnuite — nu pentru vitrină.</w:t>
+              <w:t xml:space="preserve">Fără insecticide. Fără erbicide. Fără îngrășăminte de sinteză.</w:t>
             </w:r>
           </w:p>
           <w:p>
@@ -2039,7 +2120,7 @@
                 <w:sz w:val="21"/>
                 <w:szCs w:val="21"/>
               </w:rPr>
-              <w:t xml:space="preserve">Un vin bun nu trebuie păstrat pentru ocazii. Ocazia e că e marți seara și ai ajuns acasă.</w:t>
+              <w:t xml:space="preserve">Metoda asta ne costă. Pierdem din producție în fiecare an — uneori mult. Este o alegere, nu un accident: preferăm să scoatem mai puțin, dar să știm exact ce am pus pe viță.</w:t>
             </w:r>
           </w:p>
           <w:p>
@@ -2067,7 +2148,35 @@
                 <w:sz w:val="21"/>
                 <w:szCs w:val="21"/>
               </w:rPr>
-              <w:t xml:space="preserve">Descoperă gama Omnia → [LINK_COMANDĂ]</w:t>
+              <w:t xml:space="preserve">Facem asta din 2010, pe peste 15 hectare. Nu e ușor. Dar așa vrem noi să iasă vinul din dealul ăsta.</w:t>
+            </w:r>
+          </w:p>
+          <w:p>
+            <w:pPr>
+              <w:spacing w:after="0" w:line="288"/>
+            </w:pPr>
+            <w:r>
+              <w:rPr>
+                <w:rFonts w:ascii="Calibri" w:cs="Calibri" w:eastAsia="Calibri" w:hAnsi="Calibri"/>
+                <w:color w:val="262626"/>
+                <w:sz w:val="21"/>
+                <w:szCs w:val="21"/>
+              </w:rPr>
+              <w:t xml:space="preserve"> </w:t>
+            </w:r>
+          </w:p>
+          <w:p>
+            <w:pPr>
+              <w:spacing w:after="110" w:line="288"/>
+            </w:pPr>
+            <w:r>
+              <w:rPr>
+                <w:rFonts w:ascii="Calibri" w:cs="Calibri" w:eastAsia="Calibri" w:hAnsi="Calibri"/>
+                <w:color w:val="262626"/>
+                <w:sz w:val="21"/>
+                <w:szCs w:val="21"/>
+              </w:rPr>
+              <w:t xml:space="preserve">→ [LINK_COMANDĂ]</w:t>
             </w:r>
           </w:p>
           <w:p>
@@ -2140,7 +2249,7 @@
           <w:sz w:val="19"/>
           <w:szCs w:val="19"/>
         </w:rPr>
-        <w:t xml:space="preserve">Masă de seară obișnuită, luminată cald: farfurii folosite, o sticlă Omnia, două pahare. Deliberat nearanjat.</w:t>
+        <w:t xml:space="preserve">Prepararea maceratului: planta în apă, butoiul, strecuratul, pompa de stropit. Este cel mai neobișnuit material vizual pe care îl aveți — aproape nicio cramă nu arată asta. Carusel de 4–5 imagini sau un video scurt.</w:t>
       </w:r>
     </w:p>
     <w:p>
@@ -2165,7 +2274,7 @@
           <w:sz w:val="19"/>
           <w:szCs w:val="19"/>
         </w:rPr>
-        <w:t xml:space="preserve">Buton „Cumpără acum".</w:t>
+        <w:t xml:space="preserve">Buton „Află mai multe". Promovați postarea — explică prețul mai bine decât orice altceva.</w:t>
       </w:r>
     </w:p>
     <w:p>
@@ -2190,7 +2299,27 @@
           <w:sz w:val="19"/>
           <w:szCs w:val="19"/>
         </w:rPr>
-        <w:t xml:space="preserve">#Omnia #VinEcologic #FeteascaNeagra #BabeascaNeagra #CrameleOdobesti</w:t>
+        <w:t xml:space="preserve">#VinBio #MacerateDePlante #AgriculturaEcologica #FaraPesticide #CrameleOdobesti #Odobesti</w:t>
+      </w:r>
+    </w:p>
+    <w:p>
+      <w:pPr>
+        <w:pBdr>
+          <w:left w:val="single" w:color="9A7B27" w:sz="10" w:space="10"/>
+        </w:pBdr>
+        <w:spacing w:after="140" w:before="120" w:line="276"/>
+        <w:ind w:left="200"/>
+      </w:pPr>
+      <w:r>
+        <w:rPr>
+          <w:rFonts w:ascii="Calibri" w:cs="Calibri" w:eastAsia="Calibri" w:hAnsi="Calibri"/>
+          <w:i/>
+          <w:iCs/>
+          <w:color w:val="6E6E6E"/>
+          <w:sz w:val="19"/>
+          <w:szCs w:val="19"/>
+        </w:rPr>
+        <w:t xml:space="preserve">Formularea evită intenționat orice promisiune despre efectul vinului asupra celui care îl bea. Legislația europeană interzice mențiunile de sănătate pe băuturile cu peste 1,2% alcool, iar „nu te doare capul" intră în această categorie. Textul de mai sus spune exact același lucru — dar prin ce faceți voi în vie, ceea ce este permis, verificabil și, în plus, mai convingător.</w:t>
       </w:r>
     </w:p>
     <w:p>
@@ -2208,7 +2337,7 @@
           <w:sz w:val="25"/>
           <w:szCs w:val="25"/>
         </w:rPr>
-        <w:t xml:space="preserve">5. Monșer — soiurile pe care nu le mai are aproape nimeni</w:t>
+        <w:t xml:space="preserve">5. Omnia — povestea numelui</w:t>
       </w:r>
       <w:r>
         <w:rPr>
@@ -2219,7 +2348,7 @@
           <w:sz w:val="18"/>
           <w:szCs w:val="18"/>
         </w:rPr>
-        <w:t xml:space="preserve">   · gama Monșer</w:t>
+        <w:t xml:space="preserve">   · gama Omnia</w:t>
       </w:r>
     </w:p>
     <w:p>
@@ -2244,7 +2373,7 @@
           <w:sz w:val="19"/>
           <w:szCs w:val="19"/>
         </w:rPr>
-        <w:t xml:space="preserve">Cel mai mare potențial de distribuire organică. Conținut educativ, cu miză patrimonială.</w:t>
+        <w:t xml:space="preserve">Să dea profunzime unei game ecologice de volum, prin narativ.</w:t>
       </w:r>
     </w:p>
     <w:p>
@@ -2302,7 +2431,7 @@
                 <w:sz w:val="21"/>
                 <w:szCs w:val="21"/>
               </w:rPr>
-              <w:t xml:space="preserve">Zghihara. Băbească Gri. Crâmpoșie. Cadarcă.</w:t>
+              <w:t xml:space="preserve">„Omnia mea mecum porto." Tot ce am, port cu mine.</w:t>
             </w:r>
           </w:p>
           <w:p>
@@ -2330,7 +2459,7 @@
                 <w:sz w:val="21"/>
                 <w:szCs w:val="21"/>
               </w:rPr>
-              <w:t xml:space="preserve">Dacă nu ați auzit de ele, nu e vina dumneavoastră. Sunt soiuri românești vechi, multe dintre ele de dinainte de filoxeră, pe care majoritatea podgoriilor le-au înlocuit cu nume internaționale care se vând mai ușor.</w:t>
+              <w:t xml:space="preserve">Latinescul din care vine numele gamei Omnia spune ceva simplu: important e ce rămâne cu tine, nu ce ai adunat. Am pornit gama în 2010, cu trei soiuri românești — Fetească Albă, Fetească Neagră, Băbească Neagră. Apoi am adăugat Riesling Italian, Chardonnay, Cabernet Sauvignon.</w:t>
             </w:r>
           </w:p>
           <w:p>
@@ -2358,7 +2487,7 @@
                 <w:sz w:val="21"/>
                 <w:szCs w:val="21"/>
               </w:rPr>
-              <w:t xml:space="preserve">Noi le-am păstrat. Sunt în gama Monșer, alături de Fetească Albă, Fetească Regală, Șarbă, Tămâioasă Românească și Busuioacă de Bohotin.</w:t>
+              <w:t xml:space="preserve">Toate, lucrate ecologic. Toate, gândite pentru mesele obișnuite — nu pentru vitrină.</w:t>
             </w:r>
           </w:p>
           <w:p>
@@ -2386,7 +2515,7 @@
                 <w:sz w:val="21"/>
                 <w:szCs w:val="21"/>
               </w:rPr>
-              <w:t xml:space="preserve">Numele gamei vine din a doua jumătate a secolului al XIX-lea, din lumea boierească a personajelor lui Caragiale — pe atunci, vinul de calitate se făcea în casele lor, nu în gospodării.</w:t>
+              <w:t xml:space="preserve">Un vin bun nu trebuie păstrat pentru ocazii. Ocazia e că e marți seara și ai ajuns acasă.</w:t>
             </w:r>
           </w:p>
           <w:p>
@@ -2414,35 +2543,7 @@
                 <w:sz w:val="21"/>
                 <w:szCs w:val="21"/>
               </w:rPr>
-              <w:t xml:space="preserve">Un soi dispare atunci când nu îl mai bea nimeni.</w:t>
-            </w:r>
-          </w:p>
-          <w:p>
-            <w:pPr>
-              <w:spacing w:after="0" w:line="288"/>
-            </w:pPr>
-            <w:r>
-              <w:rPr>
-                <w:rFonts w:ascii="Calibri" w:cs="Calibri" w:eastAsia="Calibri" w:hAnsi="Calibri"/>
-                <w:color w:val="262626"/>
-                <w:sz w:val="21"/>
-                <w:szCs w:val="21"/>
-              </w:rPr>
-              <w:t xml:space="preserve"> </w:t>
-            </w:r>
-          </w:p>
-          <w:p>
-            <w:pPr>
-              <w:spacing w:after="110" w:line="288"/>
-            </w:pPr>
-            <w:r>
-              <w:rPr>
-                <w:rFonts w:ascii="Calibri" w:cs="Calibri" w:eastAsia="Calibri" w:hAnsi="Calibri"/>
-                <w:color w:val="262626"/>
-                <w:sz w:val="21"/>
-                <w:szCs w:val="21"/>
-              </w:rPr>
-              <w:t xml:space="preserve">Alege un soi pe care nu l-ai gustat încă → [LINK_COMANDĂ]</w:t>
+              <w:t xml:space="preserve">Descoperă gama Omnia → [LINK_COMANDĂ]</w:t>
             </w:r>
           </w:p>
           <w:p>
@@ -2515,7 +2616,7 @@
           <w:sz w:val="19"/>
           <w:szCs w:val="19"/>
         </w:rPr>
-        <w:t xml:space="preserve">Carusel cu patru imagini, câte una pentru fiecare soi rar, cu numele scris mare pe fiecare. Ultima imagine: toate sticlele împreună.</w:t>
+        <w:t xml:space="preserve">Masă de seară obișnuită, luminată cald: farfurii folosite, o sticlă Omnia, două pahare. Deliberat nearanjat.</w:t>
       </w:r>
     </w:p>
     <w:p>
@@ -2540,7 +2641,7 @@
           <w:sz w:val="19"/>
           <w:szCs w:val="19"/>
         </w:rPr>
-        <w:t xml:space="preserve">Buton „Cumpără acum". Această postare se distribuie — încurajează explicit distribuirea în primul comentariu.</w:t>
+        <w:t xml:space="preserve">Buton „Cumpără acum".</w:t>
       </w:r>
     </w:p>
     <w:p>
@@ -2565,27 +2666,7 @@
           <w:sz w:val="19"/>
           <w:szCs w:val="19"/>
         </w:rPr>
-        <w:t xml:space="preserve">#Monser #Zghihara #Cramposie #BabeascaGri #SoiuriAutohtone #PatrimoniuViticol</w:t>
-      </w:r>
-    </w:p>
-    <w:p>
-      <w:pPr>
-        <w:pBdr>
-          <w:left w:val="single" w:color="9A7B27" w:sz="10" w:space="10"/>
-        </w:pBdr>
-        <w:spacing w:after="140" w:before="120" w:line="276"/>
-        <w:ind w:left="200"/>
-      </w:pPr>
-      <w:r>
-        <w:rPr>
-          <w:rFonts w:ascii="Calibri" w:cs="Calibri" w:eastAsia="Calibri" w:hAnsi="Calibri"/>
-          <w:i/>
-          <w:iCs/>
-          <w:color w:val="6E6E6E"/>
-          <w:sz w:val="19"/>
-          <w:szCs w:val="19"/>
-        </w:rPr>
-        <w:t xml:space="preserve">Verificați ce soiuri rare sunt efectiv pe stoc înainte de publicare. O postare care trimite către un produs epuizat pierde tot traficul plătit.</w:t>
+        <w:t xml:space="preserve">#Omnia #VinEcologic #FeteascaNeagra #BabeascaNeagra #CrameleOdobesti</w:t>
       </w:r>
     </w:p>
     <w:p>
@@ -2603,7 +2684,7 @@
           <w:sz w:val="25"/>
           <w:szCs w:val="25"/>
         </w:rPr>
-        <w:t xml:space="preserve">6. Suav — Busuioacă de Bohotin</w:t>
+        <w:t xml:space="preserve">6. Monșer — soiurile pe care nu le mai are aproape nimeni</w:t>
       </w:r>
       <w:r>
         <w:rPr>
@@ -2614,7 +2695,7 @@
           <w:sz w:val="18"/>
           <w:szCs w:val="18"/>
         </w:rPr>
-        <w:t xml:space="preserve">   · gama Suav</w:t>
+        <w:t xml:space="preserve">   · gama Monșer</w:t>
       </w:r>
     </w:p>
     <w:p>
@@ -2639,7 +2720,7 @@
           <w:sz w:val="19"/>
           <w:szCs w:val="19"/>
         </w:rPr>
-        <w:t xml:space="preserve">Să valorifice cel mai fotogenic produs din portofoliu. Roze-ul dulce are cea mai bună performanță vizuală pe Facebook.</w:t>
+        <w:t xml:space="preserve">Cel mai mare potențial de distribuire organică. Conținut educativ, cu miză patrimonială.</w:t>
       </w:r>
     </w:p>
     <w:p>
@@ -2697,7 +2778,7 @@
                 <w:sz w:val="21"/>
                 <w:szCs w:val="21"/>
               </w:rPr>
-              <w:t xml:space="preserve">Culoarea aceasta nu se corectează în telefon. Așa arată Busuioaca de Bohotin în pahar.</w:t>
+              <w:t xml:space="preserve">Zghihara. Băbească Gri. Crâmpoșie. Cadarcă.</w:t>
             </w:r>
           </w:p>
           <w:p>
@@ -2725,7 +2806,7 @@
                 <w:sz w:val="21"/>
                 <w:szCs w:val="21"/>
               </w:rPr>
-              <w:t xml:space="preserve">Un soi aromat, cules la supracoacere, din care iese un roze dulce cu parfum de petale și fruct copt. Face parte din gama Suav — prima gamă a casei gândită pentru gustul feminin, cu vinuri delicate, deloc agresive.</w:t>
+              <w:t xml:space="preserve">Dacă nu ați auzit de ele, nu e vina dumneavoastră. Sunt soiuri românești vechi, multe dintre ele de dinainte de filoxeră, pe care majoritatea podgoriilor le-au înlocuit cu nume internaționale care se vând mai ușor.</w:t>
             </w:r>
           </w:p>
           <w:p>
@@ -2753,7 +2834,7 @@
                 <w:sz w:val="21"/>
                 <w:szCs w:val="21"/>
               </w:rPr>
-              <w:t xml:space="preserve">Se bea rece, la 8–10 grade. Merge lângă un desert cu fructe, lângă brânzeturi cu mucegai — sau singur, pe o terasă, fără niciun motiv special.</w:t>
+              <w:t xml:space="preserve">Noi le-am păstrat. Sunt în gama Monșer, alături de Fetească Albă, Fetească Regală, Șarbă, Tămâioasă Românească și Busuioacă de Bohotin.</w:t>
             </w:r>
           </w:p>
           <w:p>
@@ -2781,7 +2862,63 @@
                 <w:sz w:val="21"/>
                 <w:szCs w:val="21"/>
               </w:rPr>
-              <w:t xml:space="preserve">Comandă → [LINK_COMANDĂ]</w:t>
+              <w:t xml:space="preserve">Numele gamei vine din a doua jumătate a secolului al XIX-lea, din lumea boierească a personajelor lui Caragiale — pe atunci, vinul de calitate se făcea în casele lor, nu în gospodării.</w:t>
+            </w:r>
+          </w:p>
+          <w:p>
+            <w:pPr>
+              <w:spacing w:after="0" w:line="288"/>
+            </w:pPr>
+            <w:r>
+              <w:rPr>
+                <w:rFonts w:ascii="Calibri" w:cs="Calibri" w:eastAsia="Calibri" w:hAnsi="Calibri"/>
+                <w:color w:val="262626"/>
+                <w:sz w:val="21"/>
+                <w:szCs w:val="21"/>
+              </w:rPr>
+              <w:t xml:space="preserve"> </w:t>
+            </w:r>
+          </w:p>
+          <w:p>
+            <w:pPr>
+              <w:spacing w:after="110" w:line="288"/>
+            </w:pPr>
+            <w:r>
+              <w:rPr>
+                <w:rFonts w:ascii="Calibri" w:cs="Calibri" w:eastAsia="Calibri" w:hAnsi="Calibri"/>
+                <w:color w:val="262626"/>
+                <w:sz w:val="21"/>
+                <w:szCs w:val="21"/>
+              </w:rPr>
+              <w:t xml:space="preserve">Un soi dispare atunci când nu îl mai bea nimeni.</w:t>
+            </w:r>
+          </w:p>
+          <w:p>
+            <w:pPr>
+              <w:spacing w:after="0" w:line="288"/>
+            </w:pPr>
+            <w:r>
+              <w:rPr>
+                <w:rFonts w:ascii="Calibri" w:cs="Calibri" w:eastAsia="Calibri" w:hAnsi="Calibri"/>
+                <w:color w:val="262626"/>
+                <w:sz w:val="21"/>
+                <w:szCs w:val="21"/>
+              </w:rPr>
+              <w:t xml:space="preserve"> </w:t>
+            </w:r>
+          </w:p>
+          <w:p>
+            <w:pPr>
+              <w:spacing w:after="110" w:line="288"/>
+            </w:pPr>
+            <w:r>
+              <w:rPr>
+                <w:rFonts w:ascii="Calibri" w:cs="Calibri" w:eastAsia="Calibri" w:hAnsi="Calibri"/>
+                <w:color w:val="262626"/>
+                <w:sz w:val="21"/>
+                <w:szCs w:val="21"/>
+              </w:rPr>
+              <w:t xml:space="preserve">Alege un soi pe care nu l-ai gustat încă → [LINK_COMANDĂ]</w:t>
             </w:r>
           </w:p>
           <w:p>
@@ -2854,7 +2991,7 @@
           <w:sz w:val="19"/>
           <w:szCs w:val="19"/>
         </w:rPr>
-        <w:t xml:space="preserve">Pahar în contralumină, ca să se vadă culoarea. Lumină naturală de după-amiază. Fără filtre — culoarea reală e argumentul.</w:t>
+        <w:t xml:space="preserve">Carusel cu patru imagini, câte una pentru fiecare soi rar, cu numele scris mare pe fiecare. Ultima imagine: toate sticlele împreună.</w:t>
       </w:r>
     </w:p>
     <w:p>
@@ -2879,7 +3016,7 @@
           <w:sz w:val="19"/>
           <w:szCs w:val="19"/>
         </w:rPr>
-        <w:t xml:space="preserve">Buton „Cumpără acum". Cel mai bun candidat pentru Reels de 10 secunde: turnare în pahar, cadru fix.</w:t>
+        <w:t xml:space="preserve">Buton „Cumpără acum". Această postare se distribuie — încurajează explicit distribuirea în primul comentariu.</w:t>
       </w:r>
     </w:p>
     <w:p>
@@ -2904,7 +3041,27 @@
           <w:sz w:val="19"/>
           <w:szCs w:val="19"/>
         </w:rPr>
-        <w:t xml:space="preserve">#Suav #BusuioacaDeBohotin #VinRoze #VinAromat #CrameleOdobesti</w:t>
+        <w:t xml:space="preserve">#Monser #Zghihara #Cramposie #BabeascaGri #SoiuriAutohtone #PatrimoniuViticol</w:t>
+      </w:r>
+    </w:p>
+    <w:p>
+      <w:pPr>
+        <w:pBdr>
+          <w:left w:val="single" w:color="9A7B27" w:sz="10" w:space="10"/>
+        </w:pBdr>
+        <w:spacing w:after="140" w:before="120" w:line="276"/>
+        <w:ind w:left="200"/>
+      </w:pPr>
+      <w:r>
+        <w:rPr>
+          <w:rFonts w:ascii="Calibri" w:cs="Calibri" w:eastAsia="Calibri" w:hAnsi="Calibri"/>
+          <w:i/>
+          <w:iCs/>
+          <w:color w:val="6E6E6E"/>
+          <w:sz w:val="19"/>
+          <w:szCs w:val="19"/>
+        </w:rPr>
+        <w:t xml:space="preserve">Verificați ce soiuri rare sunt efectiv pe stoc înainte de publicare. O postare care trimite către un produs epuizat pierde tot traficul plătit.</w:t>
       </w:r>
     </w:p>
     <w:p>
@@ -2922,7 +3079,7 @@
           <w:sz w:val="25"/>
           <w:szCs w:val="25"/>
         </w:rPr>
-        <w:t xml:space="preserve">7. Senator Private Collection — cupajele casei</w:t>
+        <w:t xml:space="preserve">7. Suav — Busuioacă de Bohotin</w:t>
       </w:r>
       <w:r>
         <w:rPr>
@@ -2933,7 +3090,7 @@
           <w:sz w:val="18"/>
           <w:szCs w:val="18"/>
         </w:rPr>
-        <w:t xml:space="preserve">   · gama Senator Private Collection</w:t>
+        <w:t xml:space="preserve">   · gama Suav</w:t>
       </w:r>
     </w:p>
     <w:p>
@@ -2958,7 +3115,7 @@
           <w:sz w:val="19"/>
           <w:szCs w:val="19"/>
         </w:rPr>
-        <w:t xml:space="preserve">Să susțină vânzarea premium și să deschidă discuția cu restaurantele.</w:t>
+        <w:t xml:space="preserve">Să valorifice cel mai fotogenic produs din portofoliu. Roze-ul dulce are cea mai bună performanță vizuală pe Facebook.</w:t>
       </w:r>
     </w:p>
     <w:p>
@@ -3016,7 +3173,7 @@
                 <w:sz w:val="21"/>
                 <w:szCs w:val="21"/>
               </w:rPr>
-              <w:t xml:space="preserve">Un cupaj bun nu ascunde nimic. Corectează.</w:t>
+              <w:t xml:space="preserve">Culoarea aceasta nu se corectează în telefon. Așa arată Busuioaca de Bohotin în pahar.</w:t>
             </w:r>
           </w:p>
           <w:p>
@@ -3044,7 +3201,7 @@
                 <w:sz w:val="21"/>
                 <w:szCs w:val="21"/>
               </w:rPr>
-              <w:t xml:space="preserve">Senator Private Collection, alb: Sauvignon Blanc, Riesling Italian și Fetească Regală. Primul dă nervul, al doilea structura, al treilea rotunjimea de la final.</w:t>
+              <w:t xml:space="preserve">Un soi aromat, cules la supracoacere, din care iese un roze dulce cu parfum de petale și fruct copt. Face parte din gama Suav — prima gamă a casei gândită pentru gustul feminin, cu vinuri delicate, deloc agresive.</w:t>
             </w:r>
           </w:p>
           <w:p>
@@ -3072,7 +3229,7 @@
                 <w:sz w:val="21"/>
                 <w:szCs w:val="21"/>
               </w:rPr>
-              <w:t xml:space="preserve">Roșu: Merlot, Cabernet Sauvignon și Fetească Neagră. Catifea, coloană vertebrală și un final care rămâne românesc.</w:t>
+              <w:t xml:space="preserve">Se bea rece, la 8–10 grade. Merge lângă un desert cu fructe, lângă brânzeturi cu mucegai — sau singur, pe o terasă, fără niciun motiv special.</w:t>
             </w:r>
           </w:p>
           <w:p>
@@ -3100,49 +3257,7 @@
                 <w:sz w:val="21"/>
                 <w:szCs w:val="21"/>
               </w:rPr>
-              <w:t xml:space="preserve">Sunt vinurile pe care le trimitem atunci când cineva ne cere „ceva care să nu dea greș".</w:t>
-            </w:r>
-          </w:p>
-          <w:p>
-            <w:pPr>
-              <w:spacing w:after="0" w:line="288"/>
-            </w:pPr>
-            <w:r>
-              <w:rPr>
-                <w:rFonts w:ascii="Calibri" w:cs="Calibri" w:eastAsia="Calibri" w:hAnsi="Calibri"/>
-                <w:color w:val="262626"/>
-                <w:sz w:val="21"/>
-                <w:szCs w:val="21"/>
-              </w:rPr>
-              <w:t xml:space="preserve"> </w:t>
-            </w:r>
-          </w:p>
-          <w:p>
-            <w:pPr>
-              <w:spacing w:after="110" w:line="288"/>
-            </w:pPr>
-            <w:r>
-              <w:rPr>
-                <w:rFonts w:ascii="Calibri" w:cs="Calibri" w:eastAsia="Calibri" w:hAnsi="Calibri"/>
-                <w:color w:val="262626"/>
-                <w:sz w:val="21"/>
-                <w:szCs w:val="21"/>
-              </w:rPr>
-              <w:t xml:space="preserve">Vezi colecția → [LINK_COMANDĂ]</w:t>
-            </w:r>
-          </w:p>
-          <w:p>
-            <w:pPr>
-              <w:spacing w:after="110" w:line="288"/>
-            </w:pPr>
-            <w:r>
-              <w:rPr>
-                <w:rFonts w:ascii="Calibri" w:cs="Calibri" w:eastAsia="Calibri" w:hAnsi="Calibri"/>
-                <w:color w:val="262626"/>
-                <w:sz w:val="21"/>
-                <w:szCs w:val="21"/>
-              </w:rPr>
-              <w:t xml:space="preserve">Restaurante și distribuitori: [EMAIL] · [TELEFON]</w:t>
+              <w:t xml:space="preserve">Comandă → [LINK_COMANDĂ]</w:t>
             </w:r>
           </w:p>
           <w:p>
@@ -3215,7 +3330,7 @@
           <w:sz w:val="19"/>
           <w:szCs w:val="19"/>
         </w:rPr>
-        <w:t xml:space="preserve">Cele două sticle, alb și roșu, pe fundal neutru închis, iluminate simetric. Estetică de carte de vinuri.</w:t>
+        <w:t xml:space="preserve">Pahar în contralumină, ca să se vadă culoarea. Lumină naturală de după-amiază. Fără filtre — culoarea reală e argumentul.</w:t>
       </w:r>
     </w:p>
     <w:p>
@@ -3240,7 +3355,7 @@
           <w:sz w:val="19"/>
           <w:szCs w:val="19"/>
         </w:rPr>
-        <w:t xml:space="preserve">Buton „Trimite mesaj" — deschide conversații cu HoReCa direct din postare.</w:t>
+        <w:t xml:space="preserve">Buton „Cumpără acum". Cel mai bun candidat pentru Reels de 10 secunde: turnare în pahar, cadru fix.</w:t>
       </w:r>
     </w:p>
     <w:p>
@@ -3265,7 +3380,7 @@
           <w:sz w:val="19"/>
           <w:szCs w:val="19"/>
         </w:rPr>
-        <w:t xml:space="preserve">#SenatorPrivateCollection #Cupaj #VinPremium #HoReCa #CrameleOdobesti</w:t>
+        <w:t xml:space="preserve">#Suav #BusuioacaDeBohotin #VinRoze #VinAromat #CrameleOdobesti</w:t>
       </w:r>
     </w:p>
     <w:p>
@@ -3283,7 +3398,7 @@
           <w:sz w:val="25"/>
           <w:szCs w:val="25"/>
         </w:rPr>
-        <w:t xml:space="preserve">8. Ce pui în pahar, în funcție de ce ai în farfurie</w:t>
+        <w:t xml:space="preserve">8. Senator Private Collection — cupajele casei</w:t>
       </w:r>
       <w:r>
         <w:rPr>
@@ -3294,7 +3409,7 @@
           <w:sz w:val="18"/>
           <w:szCs w:val="18"/>
         </w:rPr>
-        <w:t xml:space="preserve">   · conținut util, multi-gamă</w:t>
+        <w:t xml:space="preserve">   · gama Senator Private Collection</w:t>
       </w:r>
     </w:p>
     <w:p>
@@ -3319,7 +3434,7 @@
           <w:sz w:val="19"/>
           <w:szCs w:val="19"/>
         </w:rPr>
-        <w:t xml:space="preserve">Cea mai salvată postare din pachet. Salvările prelungesc durata de viață a postării cu săptămâni.</w:t>
+        <w:t xml:space="preserve">Să susțină vânzarea premium și să deschidă discuția cu restaurantele.</w:t>
       </w:r>
     </w:p>
     <w:p>
@@ -3377,7 +3492,7 @@
                 <w:sz w:val="21"/>
                 <w:szCs w:val="21"/>
               </w:rPr>
-              <w:t xml:space="preserve">Ghid scurt de asociere, fără snobism.</w:t>
+              <w:t xml:space="preserve">Un cupaj bun nu ascunde nimic. Corectează.</w:t>
             </w:r>
           </w:p>
           <w:p>
@@ -3405,77 +3520,7 @@
                 <w:sz w:val="21"/>
                 <w:szCs w:val="21"/>
               </w:rPr>
-              <w:t xml:space="preserve">Pește, fructe de mare, salate → Șarbă sau Fetească Regală, din gama Monșer</w:t>
-            </w:r>
-          </w:p>
-          <w:p>
-            <w:pPr>
-              <w:spacing w:after="110" w:line="288"/>
-            </w:pPr>
-            <w:r>
-              <w:rPr>
-                <w:rFonts w:ascii="Calibri" w:cs="Calibri" w:eastAsia="Calibri" w:hAnsi="Calibri"/>
-                <w:color w:val="262626"/>
-                <w:sz w:val="21"/>
-                <w:szCs w:val="21"/>
-              </w:rPr>
-              <w:t xml:space="preserve">Pui la cuptor, paste în sos alb → Riesling Italian, Omnia</w:t>
-            </w:r>
-          </w:p>
-          <w:p>
-            <w:pPr>
-              <w:spacing w:after="110" w:line="288"/>
-            </w:pPr>
-            <w:r>
-              <w:rPr>
-                <w:rFonts w:ascii="Calibri" w:cs="Calibri" w:eastAsia="Calibri" w:hAnsi="Calibri"/>
-                <w:color w:val="262626"/>
-                <w:sz w:val="21"/>
-                <w:szCs w:val="21"/>
-              </w:rPr>
-              <w:t xml:space="preserve">Brânzeturi maturate, aperitive → Fetească Albă</w:t>
-            </w:r>
-          </w:p>
-          <w:p>
-            <w:pPr>
-              <w:spacing w:after="110" w:line="288"/>
-            </w:pPr>
-            <w:r>
-              <w:rPr>
-                <w:rFonts w:ascii="Calibri" w:cs="Calibri" w:eastAsia="Calibri" w:hAnsi="Calibri"/>
-                <w:color w:val="262626"/>
-                <w:sz w:val="21"/>
-                <w:szCs w:val="21"/>
-              </w:rPr>
-              <w:t xml:space="preserve">Sarmale, friptură, grătar → Băbească Neagră</w:t>
-            </w:r>
-          </w:p>
-          <w:p>
-            <w:pPr>
-              <w:spacing w:after="110" w:line="288"/>
-            </w:pPr>
-            <w:r>
-              <w:rPr>
-                <w:rFonts w:ascii="Calibri" w:cs="Calibri" w:eastAsia="Calibri" w:hAnsi="Calibri"/>
-                <w:color w:val="262626"/>
-                <w:sz w:val="21"/>
-                <w:szCs w:val="21"/>
-              </w:rPr>
-              <w:t xml:space="preserve">Vânat, carne roșie la cuptor → Fetească Neagră sau Occultus Rezervă</w:t>
-            </w:r>
-          </w:p>
-          <w:p>
-            <w:pPr>
-              <w:spacing w:after="110" w:line="288"/>
-            </w:pPr>
-            <w:r>
-              <w:rPr>
-                <w:rFonts w:ascii="Calibri" w:cs="Calibri" w:eastAsia="Calibri" w:hAnsi="Calibri"/>
-                <w:color w:val="262626"/>
-                <w:sz w:val="21"/>
-                <w:szCs w:val="21"/>
-              </w:rPr>
-              <w:t xml:space="preserve">Deserturi cu fructe → Busuioacă de Bohotin, Suav</w:t>
+              <w:t xml:space="preserve">Senator Private Collection, alb: Sauvignon Blanc, Riesling Italian și Fetească Regală. Primul dă nervul, al doilea structura, al treilea rotunjimea de la final.</w:t>
             </w:r>
           </w:p>
           <w:p>
@@ -3503,7 +3548,7 @@
                 <w:sz w:val="21"/>
                 <w:szCs w:val="21"/>
               </w:rPr>
-              <w:t xml:space="preserve">Iar dacă nu vreți să rețineți nimic: alb la mâncare ușoară, roșu la mâncare consistentă. Restul e gustul dumneavoastră, care are întotdeauna dreptate.</w:t>
+              <w:t xml:space="preserve">Roșu: Merlot, Cabernet Sauvignon și Fetească Neagră. Catifea, coloană vertebrală și un final care rămâne românesc.</w:t>
             </w:r>
           </w:p>
           <w:p>
@@ -3531,7 +3576,7 @@
                 <w:sz w:val="21"/>
                 <w:szCs w:val="21"/>
               </w:rPr>
-              <w:t xml:space="preserve">Salvați postarea pentru duminică.</w:t>
+              <w:t xml:space="preserve">Sunt vinurile pe care le trimitem atunci când cineva ne cere „ceva care să nu dea greș".</w:t>
             </w:r>
           </w:p>
           <w:p>
@@ -3559,7 +3604,21 @@
                 <w:sz w:val="21"/>
                 <w:szCs w:val="21"/>
               </w:rPr>
-              <w:t xml:space="preserve">→ [LINK_COMANDĂ]</w:t>
+              <w:t xml:space="preserve">Vezi colecția → [LINK_COMANDĂ]</w:t>
+            </w:r>
+          </w:p>
+          <w:p>
+            <w:pPr>
+              <w:spacing w:after="110" w:line="288"/>
+            </w:pPr>
+            <w:r>
+              <w:rPr>
+                <w:rFonts w:ascii="Calibri" w:cs="Calibri" w:eastAsia="Calibri" w:hAnsi="Calibri"/>
+                <w:color w:val="262626"/>
+                <w:sz w:val="21"/>
+                <w:szCs w:val="21"/>
+              </w:rPr>
+              <w:t xml:space="preserve">Restaurante și distribuitori: [EMAIL] · [TELEFON]</w:t>
             </w:r>
           </w:p>
           <w:p>
@@ -3632,7 +3691,7 @@
           <w:sz w:val="19"/>
           <w:szCs w:val="19"/>
         </w:rPr>
-        <w:t xml:space="preserve">Infografic curat, șase rânduri, tipografie mare, paletă burgundy–crem. Trebuie să fie lizibil pe telefon fără zoom.</w:t>
+        <w:t xml:space="preserve">Cele două sticle, alb și roșu, pe fundal neutru închis, iluminate simetric. Estetică de carte de vinuri.</w:t>
       </w:r>
     </w:p>
     <w:p>
@@ -3657,7 +3716,7 @@
           <w:sz w:val="19"/>
           <w:szCs w:val="19"/>
         </w:rPr>
-        <w:t xml:space="preserve">Buton „Cumpără acum". Rulează-o și ca reclamă permanentă — nu se demodează.</w:t>
+        <w:t xml:space="preserve">Buton „Trimite mesaj" — deschide conversații cu HoReCa direct din postare.</w:t>
       </w:r>
     </w:p>
     <w:p>
@@ -3682,7 +3741,7 @@
           <w:sz w:val="19"/>
           <w:szCs w:val="19"/>
         </w:rPr>
-        <w:t xml:space="preserve">#AsociereVinMancare #FoodPairing #GhidVin #CrameleOdobesti</w:t>
+        <w:t xml:space="preserve">#SenatorPrivateCollection #Cupaj #VinPremium #HoReCa #CrameleOdobesti</w:t>
       </w:r>
     </w:p>
     <w:p>
@@ -3700,7 +3759,7 @@
           <w:sz w:val="25"/>
           <w:szCs w:val="25"/>
         </w:rPr>
-        <w:t xml:space="preserve">9. Hereditas — ce moștenim</w:t>
+        <w:t xml:space="preserve">9. Ce pui în pahar, în funcție de ce ai în farfurie</w:t>
       </w:r>
       <w:r>
         <w:rPr>
@@ -3711,7 +3770,7 @@
           <w:sz w:val="18"/>
           <w:szCs w:val="18"/>
         </w:rPr>
-        <w:t xml:space="preserve">   · gama Hereditas</w:t>
+        <w:t xml:space="preserve">   · conținut util, multi-gamă</w:t>
       </w:r>
     </w:p>
     <w:p>
@@ -3736,7 +3795,7 @@
           <w:sz w:val="19"/>
           <w:szCs w:val="19"/>
         </w:rPr>
-        <w:t xml:space="preserve">Postare de brand cu încărcătură emoțională, programată în weekend.</w:t>
+        <w:t xml:space="preserve">Cea mai salvată postare din pachet. Salvările prelungesc durata de viață a postării cu săptămâni.</w:t>
       </w:r>
     </w:p>
     <w:p>
@@ -3794,7 +3853,7 @@
                 <w:sz w:val="21"/>
                 <w:szCs w:val="21"/>
               </w:rPr>
-              <w:t xml:space="preserve">Hereditas înseamnă moștenire. Am dat numele acesta gamei pentru că despre asta e vorba, până la urmă.</w:t>
+              <w:t xml:space="preserve">Ghid scurt de asociere, fără snobism.</w:t>
             </w:r>
           </w:p>
           <w:p>
@@ -3822,7 +3881,77 @@
                 <w:sz w:val="21"/>
                 <w:szCs w:val="21"/>
               </w:rPr>
-              <w:t xml:space="preserve">Fetească Albă și Băbească Neagră, lucrate ecologic. Două soiuri românești care erau aici înaintea noastră și care vor fi aici și după.</w:t>
+              <w:t xml:space="preserve">Pește, fructe de mare, salate → Șarbă sau Fetească Regală, din gama Monșer</w:t>
+            </w:r>
+          </w:p>
+          <w:p>
+            <w:pPr>
+              <w:spacing w:after="110" w:line="288"/>
+            </w:pPr>
+            <w:r>
+              <w:rPr>
+                <w:rFonts w:ascii="Calibri" w:cs="Calibri" w:eastAsia="Calibri" w:hAnsi="Calibri"/>
+                <w:color w:val="262626"/>
+                <w:sz w:val="21"/>
+                <w:szCs w:val="21"/>
+              </w:rPr>
+              <w:t xml:space="preserve">Pui la cuptor, paste în sos alb → Riesling Italian, Omnia</w:t>
+            </w:r>
+          </w:p>
+          <w:p>
+            <w:pPr>
+              <w:spacing w:after="110" w:line="288"/>
+            </w:pPr>
+            <w:r>
+              <w:rPr>
+                <w:rFonts w:ascii="Calibri" w:cs="Calibri" w:eastAsia="Calibri" w:hAnsi="Calibri"/>
+                <w:color w:val="262626"/>
+                <w:sz w:val="21"/>
+                <w:szCs w:val="21"/>
+              </w:rPr>
+              <w:t xml:space="preserve">Brânzeturi maturate, aperitive → Fetească Albă</w:t>
+            </w:r>
+          </w:p>
+          <w:p>
+            <w:pPr>
+              <w:spacing w:after="110" w:line="288"/>
+            </w:pPr>
+            <w:r>
+              <w:rPr>
+                <w:rFonts w:ascii="Calibri" w:cs="Calibri" w:eastAsia="Calibri" w:hAnsi="Calibri"/>
+                <w:color w:val="262626"/>
+                <w:sz w:val="21"/>
+                <w:szCs w:val="21"/>
+              </w:rPr>
+              <w:t xml:space="preserve">Sarmale, friptură, grătar → Băbească Neagră</w:t>
+            </w:r>
+          </w:p>
+          <w:p>
+            <w:pPr>
+              <w:spacing w:after="110" w:line="288"/>
+            </w:pPr>
+            <w:r>
+              <w:rPr>
+                <w:rFonts w:ascii="Calibri" w:cs="Calibri" w:eastAsia="Calibri" w:hAnsi="Calibri"/>
+                <w:color w:val="262626"/>
+                <w:sz w:val="21"/>
+                <w:szCs w:val="21"/>
+              </w:rPr>
+              <w:t xml:space="preserve">Vânat, carne roșie la cuptor → Fetească Neagră sau Occultus Rezervă</w:t>
+            </w:r>
+          </w:p>
+          <w:p>
+            <w:pPr>
+              <w:spacing w:after="110" w:line="288"/>
+            </w:pPr>
+            <w:r>
+              <w:rPr>
+                <w:rFonts w:ascii="Calibri" w:cs="Calibri" w:eastAsia="Calibri" w:hAnsi="Calibri"/>
+                <w:color w:val="262626"/>
+                <w:sz w:val="21"/>
+                <w:szCs w:val="21"/>
+              </w:rPr>
+              <w:t xml:space="preserve">Deserturi cu fructe → Busuioacă de Bohotin, Suav</w:t>
             </w:r>
           </w:p>
           <w:p>
@@ -3850,7 +3979,35 @@
                 <w:sz w:val="21"/>
                 <w:szCs w:val="21"/>
               </w:rPr>
-              <w:t xml:space="preserve">Noi nu deținem dealul acesta. Îl folosim o vreme, cu grijă, și îl predăm mai departe.</w:t>
+              <w:t xml:space="preserve">Iar dacă nu vreți să rețineți nimic: alb la mâncare ușoară, roșu la mâncare consistentă. Restul e gustul dumneavoastră, care are întotdeauna dreptate.</w:t>
+            </w:r>
+          </w:p>
+          <w:p>
+            <w:pPr>
+              <w:spacing w:after="0" w:line="288"/>
+            </w:pPr>
+            <w:r>
+              <w:rPr>
+                <w:rFonts w:ascii="Calibri" w:cs="Calibri" w:eastAsia="Calibri" w:hAnsi="Calibri"/>
+                <w:color w:val="262626"/>
+                <w:sz w:val="21"/>
+                <w:szCs w:val="21"/>
+              </w:rPr>
+              <w:t xml:space="preserve"> </w:t>
+            </w:r>
+          </w:p>
+          <w:p>
+            <w:pPr>
+              <w:spacing w:after="110" w:line="288"/>
+            </w:pPr>
+            <w:r>
+              <w:rPr>
+                <w:rFonts w:ascii="Calibri" w:cs="Calibri" w:eastAsia="Calibri" w:hAnsi="Calibri"/>
+                <w:color w:val="262626"/>
+                <w:sz w:val="21"/>
+                <w:szCs w:val="21"/>
+              </w:rPr>
+              <w:t xml:space="preserve">Salvați postarea pentru duminică.</w:t>
             </w:r>
           </w:p>
           <w:p>
@@ -3951,7 +4108,7 @@
           <w:sz w:val="19"/>
           <w:szCs w:val="19"/>
         </w:rPr>
-        <w:t xml:space="preserve">Alb-negru sau desaturat: mâini bătrâne și mâini tinere pe același butuc de viță. Dacă aveți fotografii de arhivă ale cramei, acesta este locul lor.</w:t>
+        <w:t xml:space="preserve">Infografic curat, șase rânduri, tipografie mare, paletă burgundy–crem. Trebuie să fie lizibil pe telefon fără zoom.</w:t>
       </w:r>
     </w:p>
     <w:p>
@@ -3976,7 +4133,7 @@
           <w:sz w:val="19"/>
           <w:szCs w:val="19"/>
         </w:rPr>
-        <w:t xml:space="preserve">Fără buton de cumpărare. Obiectivul este afinitatea, nu conversia imediată.</w:t>
+        <w:t xml:space="preserve">Buton „Cumpără acum". Rulează-o și ca reclamă permanentă — nu se demodează.</w:t>
       </w:r>
     </w:p>
     <w:p>
@@ -4001,7 +4158,7 @@
           <w:sz w:val="19"/>
           <w:szCs w:val="19"/>
         </w:rPr>
-        <w:t xml:space="preserve">#Hereditas #Mostenire #VinEcologic #FeteascaAlba #BabeascaNeagra</w:t>
+        <w:t xml:space="preserve">#AsociereVinMancare #FoodPairing #GhidVin #CrameleOdobesti</w:t>
       </w:r>
     </w:p>
     <w:p>
@@ -4019,7 +4176,7 @@
           <w:sz w:val="25"/>
           <w:szCs w:val="25"/>
         </w:rPr>
-        <w:t xml:space="preserve">10. Glia — Șarbă, soiul locului</w:t>
+        <w:t xml:space="preserve">10. Hereditas — ce moștenim</w:t>
       </w:r>
       <w:r>
         <w:rPr>
@@ -4030,7 +4187,7 @@
           <w:sz w:val="18"/>
           <w:szCs w:val="18"/>
         </w:rPr>
-        <w:t xml:space="preserve">   · gama Glia</w:t>
+        <w:t xml:space="preserve">   · gama Hereditas</w:t>
       </w:r>
     </w:p>
     <w:p>
@@ -4055,7 +4212,7 @@
           <w:sz w:val="19"/>
           <w:szCs w:val="19"/>
         </w:rPr>
-        <w:t xml:space="preserve">Să promoveze un soi local puțin cunoscut în afara Vrancei, cu argument de vechime.</w:t>
+        <w:t xml:space="preserve">Postare de brand cu încărcătură emoțională, programată în weekend.</w:t>
       </w:r>
     </w:p>
     <w:p>
@@ -4113,7 +4270,7 @@
                 <w:sz w:val="21"/>
                 <w:szCs w:val="21"/>
               </w:rPr>
-              <w:t xml:space="preserve">„Glie" e un cuvânt pe care nu îl mai folosim des. Înseamnă pământ roditor.</w:t>
+              <w:t xml:space="preserve">Hereditas înseamnă moștenire. Am dat numele acesta gamei pentru că despre asta e vorba, până la urmă.</w:t>
             </w:r>
           </w:p>
           <w:p>
@@ -4141,7 +4298,7 @@
                 <w:sz w:val="21"/>
                 <w:szCs w:val="21"/>
               </w:rPr>
-              <w:t xml:space="preserve">Din el vine numele gamei — și în ea am pus Șarba, un soi care se simte acasă la Odobești și aproape nicăieri altundeva. Alb sec, cu aciditate vie și un final curat, sec, fără urmă de dulceață.</w:t>
+              <w:t xml:space="preserve">Fetească Albă și Băbească Neagră, lucrate ecologic. Două soiuri românești care erau aici înaintea noastră și care vor fi aici și după.</w:t>
             </w:r>
           </w:p>
           <w:p>
@@ -4169,7 +4326,7 @@
                 <w:sz w:val="21"/>
                 <w:szCs w:val="21"/>
               </w:rPr>
-              <w:t xml:space="preserve">E vinul de care ai nevoie când mâncarea e simplă și bună: pește la grătar, o salată cu roșii de grădină, o bucată de brânză proaspătă.</w:t>
+              <w:t xml:space="preserve">Noi nu deținem dealul acesta. Îl folosim o vreme, cu grijă, și îl predăm mai departe.</w:t>
             </w:r>
           </w:p>
           <w:p>
@@ -4197,7 +4354,7 @@
                 <w:sz w:val="21"/>
                 <w:szCs w:val="21"/>
               </w:rPr>
-              <w:t xml:space="preserve">Recolta [AN] → [LINK_COMANDĂ]</w:t>
+              <w:t xml:space="preserve">→ [LINK_COMANDĂ]</w:t>
             </w:r>
           </w:p>
           <w:p>
@@ -4270,7 +4427,7 @@
           <w:sz w:val="19"/>
           <w:szCs w:val="19"/>
         </w:rPr>
-        <w:t xml:space="preserve">Sticla pe o masă de lemn, afară, lângă o farfurie reală de mâncare. Lumină de prânz.</w:t>
+        <w:t xml:space="preserve">Alb-negru sau desaturat: mâini bătrâne și mâini tinere pe același butuc de viță. Dacă aveți fotografii de arhivă ale cramei, acesta este locul lor.</w:t>
       </w:r>
     </w:p>
     <w:p>
@@ -4295,7 +4452,7 @@
           <w:sz w:val="19"/>
           <w:szCs w:val="19"/>
         </w:rPr>
-        <w:t xml:space="preserve">Buton „Cumpără acum".</w:t>
+        <w:t xml:space="preserve">Fără buton de cumpărare. Obiectivul este afinitatea, nu conversia imediată.</w:t>
       </w:r>
     </w:p>
     <w:p>
@@ -4320,27 +4477,7 @@
           <w:sz w:val="19"/>
           <w:szCs w:val="19"/>
         </w:rPr>
-        <w:t xml:space="preserve">#Glia #Sarba #VinAlbSec #Odobesti #SoiuriRomanesti</w:t>
-      </w:r>
-    </w:p>
-    <w:p>
-      <w:pPr>
-        <w:pBdr>
-          <w:left w:val="single" w:color="9A7B27" w:sz="10" w:space="10"/>
-        </w:pBdr>
-        <w:spacing w:after="140" w:before="120" w:line="276"/>
-        <w:ind w:left="200"/>
-      </w:pPr>
-      <w:r>
-        <w:rPr>
-          <w:rFonts w:ascii="Calibri" w:cs="Calibri" w:eastAsia="Calibri" w:hAnsi="Calibri"/>
-          <w:i/>
-          <w:iCs/>
-          <w:color w:val="6E6E6E"/>
-          <w:sz w:val="19"/>
-          <w:szCs w:val="19"/>
-        </w:rPr>
-        <w:t xml:space="preserve">Completați [AN] cu recolta aflată la vânzare în momentul publicării.</w:t>
+        <w:t xml:space="preserve">#Hereditas #Mostenire #VinEcologic #FeteascaAlba #BabeascaNeagra</w:t>
       </w:r>
     </w:p>
     <w:p>
@@ -4358,7 +4495,7 @@
           <w:sz w:val="25"/>
           <w:szCs w:val="25"/>
         </w:rPr>
-        <w:t xml:space="preserve">11. Parteneriate, HoReCa și cadouri de firmă</w:t>
+        <w:t xml:space="preserve">11. Glia — Șarbă, soiul locului</w:t>
       </w:r>
       <w:r>
         <w:rPr>
@@ -4369,7 +4506,7 @@
           <w:sz w:val="18"/>
           <w:szCs w:val="18"/>
         </w:rPr>
-        <w:t xml:space="preserve">   · B2B</w:t>
+        <w:t xml:space="preserve">   · gama Glia</w:t>
       </w:r>
     </w:p>
     <w:p>
@@ -4394,7 +4531,7 @@
           <w:sz w:val="19"/>
           <w:szCs w:val="19"/>
         </w:rPr>
-        <w:t xml:space="preserve">Cea mai mare valoare pe comandă din tot pachetul. O singură conversie acoperă bugetul lunar de promovare.</w:t>
+        <w:t xml:space="preserve">Să promoveze un soi local puțin cunoscut în afara Vrancei, cu argument de vechime.</w:t>
       </w:r>
     </w:p>
     <w:p>
@@ -4452,7 +4589,7 @@
                 <w:sz w:val="21"/>
                 <w:szCs w:val="21"/>
               </w:rPr>
-              <w:t xml:space="preserve">Pentru restaurante, magazine și companii.</w:t>
+              <w:t xml:space="preserve">„Glie" e un cuvânt pe care nu îl mai folosim des. Înseamnă pământ roditor.</w:t>
             </w:r>
           </w:p>
           <w:p>
@@ -4480,7 +4617,7 @@
                 <w:sz w:val="21"/>
                 <w:szCs w:val="21"/>
               </w:rPr>
-              <w:t xml:space="preserve">Lucrăm cu parteneri care au nevoie de volum constant și de o poveste pe care să o poată spune clienților lor. Ce putem oferi:</w:t>
+              <w:t xml:space="preserve">Din el vine numele gamei — și în ea am pus Șarba, un soi care se simte acasă la Odobești și aproape nicăieri altundeva. Alb sec, cu aciditate vie și un final curat, sec, fără urmă de dulceață.</w:t>
             </w:r>
           </w:p>
           <w:p>
@@ -4508,63 +4645,7 @@
                 <w:sz w:val="21"/>
                 <w:szCs w:val="21"/>
               </w:rPr>
-              <w:t xml:space="preserve">· portofoliu de peste douăzeci de soiuri, românești și internaționale</w:t>
-            </w:r>
-          </w:p>
-          <w:p>
-            <w:pPr>
-              <w:spacing w:after="110" w:line="288"/>
-            </w:pPr>
-            <w:r>
-              <w:rPr>
-                <w:rFonts w:ascii="Calibri" w:cs="Calibri" w:eastAsia="Calibri" w:hAnsi="Calibri"/>
-                <w:color w:val="262626"/>
-                <w:sz w:val="21"/>
-                <w:szCs w:val="21"/>
-              </w:rPr>
-              <w:t xml:space="preserve">· game ecologice certificate — un argument tot mai căutat în carta de vinuri</w:t>
-            </w:r>
-          </w:p>
-          <w:p>
-            <w:pPr>
-              <w:spacing w:after="110" w:line="288"/>
-            </w:pPr>
-            <w:r>
-              <w:rPr>
-                <w:rFonts w:ascii="Calibri" w:cs="Calibri" w:eastAsia="Calibri" w:hAnsi="Calibri"/>
-                <w:color w:val="262626"/>
-                <w:sz w:val="21"/>
-                <w:szCs w:val="21"/>
-              </w:rPr>
-              <w:t xml:space="preserve">· îmbuteliere în sticlă și bag-in-box, în funcție de destinație</w:t>
-            </w:r>
-          </w:p>
-          <w:p>
-            <w:pPr>
-              <w:spacing w:after="110" w:line="288"/>
-            </w:pPr>
-            <w:r>
-              <w:rPr>
-                <w:rFonts w:ascii="Calibri" w:cs="Calibri" w:eastAsia="Calibri" w:hAnsi="Calibri"/>
-                <w:color w:val="262626"/>
-                <w:sz w:val="21"/>
-                <w:szCs w:val="21"/>
-              </w:rPr>
-              <w:t xml:space="preserve">· pachete cadou personalizate cu eticheta companiei, pentru sărbători și evenimente</w:t>
-            </w:r>
-          </w:p>
-          <w:p>
-            <w:pPr>
-              <w:spacing w:after="110" w:line="288"/>
-            </w:pPr>
-            <w:r>
-              <w:rPr>
-                <w:rFonts w:ascii="Calibri" w:cs="Calibri" w:eastAsia="Calibri" w:hAnsi="Calibri"/>
-                <w:color w:val="262626"/>
-                <w:sz w:val="21"/>
-                <w:szCs w:val="21"/>
-              </w:rPr>
-              <w:t xml:space="preserve">· livrare la o adresă sau la fiecare destinatar în parte</w:t>
+              <w:t xml:space="preserve">E vinul de care ai nevoie când mâncarea e simplă și bună: pește la grătar, o salată cu roșii de grădină, o bucată de brânză proaspătă.</w:t>
             </w:r>
           </w:p>
           <w:p>
@@ -4592,35 +4673,7 @@
                 <w:sz w:val="21"/>
                 <w:szCs w:val="21"/>
               </w:rPr>
-              <w:t xml:space="preserve">Spuneți-ne bugetul și numărul de pachete; revenim cu două-trei propuneri și cu prețurile de partener.</w:t>
-            </w:r>
-          </w:p>
-          <w:p>
-            <w:pPr>
-              <w:spacing w:after="0" w:line="288"/>
-            </w:pPr>
-            <w:r>
-              <w:rPr>
-                <w:rFonts w:ascii="Calibri" w:cs="Calibri" w:eastAsia="Calibri" w:hAnsi="Calibri"/>
-                <w:color w:val="262626"/>
-                <w:sz w:val="21"/>
-                <w:szCs w:val="21"/>
-              </w:rPr>
-              <w:t xml:space="preserve"> </w:t>
-            </w:r>
-          </w:p>
-          <w:p>
-            <w:pPr>
-              <w:spacing w:after="110" w:line="288"/>
-            </w:pPr>
-            <w:r>
-              <w:rPr>
-                <w:rFonts w:ascii="Calibri" w:cs="Calibri" w:eastAsia="Calibri" w:hAnsi="Calibri"/>
-                <w:color w:val="262626"/>
-                <w:sz w:val="21"/>
-                <w:szCs w:val="21"/>
-              </w:rPr>
-              <w:t xml:space="preserve">[EMAIL] · [TELEFON]</w:t>
+              <w:t xml:space="preserve">Recolta [AN] → [LINK_COMANDĂ]</w:t>
             </w:r>
           </w:p>
           <w:p>
@@ -4693,7 +4746,7 @@
           <w:sz w:val="19"/>
           <w:szCs w:val="19"/>
         </w:rPr>
-        <w:t xml:space="preserve">Pachet cadou finalizat, cu etichetă personalizată, lângă o cutie de lemn deschisă. Alternativ: raftul unui restaurant partener.</w:t>
+        <w:t xml:space="preserve">Sticla pe o masă de lemn, afară, lângă o farfurie reală de mâncare. Lumină de prânz.</w:t>
       </w:r>
     </w:p>
     <w:p>
@@ -4718,7 +4771,7 @@
           <w:sz w:val="19"/>
           <w:szCs w:val="19"/>
         </w:rPr>
-        <w:t xml:space="preserve">Buton „Trimite mesaj". Promovați această postare separat, țintit pe titluri de funcție: administrator, achiziții, HR, office manager.</w:t>
+        <w:t xml:space="preserve">Buton „Cumpără acum".</w:t>
       </w:r>
     </w:p>
     <w:p>
@@ -4743,7 +4796,7 @@
           <w:sz w:val="19"/>
           <w:szCs w:val="19"/>
         </w:rPr>
-        <w:t xml:space="preserve">#CadouriCorporate #HoReCa #Parteneriate #VinRomanesc #CrameleOdobesti</w:t>
+        <w:t xml:space="preserve">#Glia #Sarba #VinAlbSec #Odobesti #SoiuriRomanesti</w:t>
       </w:r>
     </w:p>
     <w:p>
@@ -4763,7 +4816,7 @@
           <w:sz w:val="19"/>
           <w:szCs w:val="19"/>
         </w:rPr>
-        <w:t xml:space="preserve">Cadourile de firmă se decid în septembrie–octombrie, nu în decembrie. Publicați această postare devreme.</w:t>
+        <w:t xml:space="preserve">Completați [AN] cu recolta aflată la vânzare în momentul publicării.</w:t>
       </w:r>
     </w:p>
     <w:p>
@@ -4781,7 +4834,430 @@
           <w:sz w:val="25"/>
           <w:szCs w:val="25"/>
         </w:rPr>
-        <w:t xml:space="preserve">12. Pachetul de descoperire — oferta de conversie</w:t>
+        <w:t xml:space="preserve">12. Parteneriate, HoReCa și cadouri de firmă</w:t>
+      </w:r>
+      <w:r>
+        <w:rPr>
+          <w:rFonts w:ascii="Calibri" w:cs="Calibri" w:eastAsia="Calibri" w:hAnsi="Calibri"/>
+          <w:i/>
+          <w:iCs/>
+          <w:color w:val="6E6E6E"/>
+          <w:sz w:val="18"/>
+          <w:szCs w:val="18"/>
+        </w:rPr>
+        <w:t xml:space="preserve">   · B2B</w:t>
+      </w:r>
+    </w:p>
+    <w:p>
+      <w:pPr>
+        <w:spacing w:after="90" w:line="276"/>
+      </w:pPr>
+      <w:r>
+        <w:rPr>
+          <w:rFonts w:ascii="Calibri" w:cs="Calibri" w:eastAsia="Calibri" w:hAnsi="Calibri"/>
+          <w:b/>
+          <w:bCs/>
+          <w:color w:val="5E1026"/>
+          <w:sz w:val="19"/>
+          <w:szCs w:val="19"/>
+        </w:rPr>
+        <w:t xml:space="preserve">Obiectiv — </w:t>
+      </w:r>
+      <w:r>
+        <w:rPr>
+          <w:rFonts w:ascii="Calibri" w:cs="Calibri" w:eastAsia="Calibri" w:hAnsi="Calibri"/>
+          <w:color w:val="262626"/>
+          <w:sz w:val="19"/>
+          <w:szCs w:val="19"/>
+        </w:rPr>
+        <w:t xml:space="preserve">Cea mai mare valoare pe comandă din tot pachetul. O singură conversie acoperă bugetul lunar de promovare.</w:t>
+      </w:r>
+    </w:p>
+    <w:p>
+      <w:pPr>
+        <w:spacing w:after="70" w:before="200"/>
+      </w:pPr>
+      <w:r>
+        <w:rPr>
+          <w:rFonts w:ascii="Calibri" w:cs="Calibri" w:eastAsia="Calibri" w:hAnsi="Calibri"/>
+          <w:b/>
+          <w:bCs/>
+          <w:color w:val="9A7B27"/>
+          <w:spacing w:val="30"/>
+          <w:sz w:val="16"/>
+          <w:szCs w:val="16"/>
+        </w:rPr>
+        <w:t xml:space="preserve">TEXT DE PUBLICAT</w:t>
+      </w:r>
+    </w:p>
+    <w:tbl>
+      <w:tblPr>
+        <w:tblW w:type="dxa" w:w="9026"/>
+        <w:tblBorders>
+          <w:top w:val="single" w:color="DED3C8" w:sz="4"/>
+          <w:left w:val="single" w:color="5E1026" w:sz="18"/>
+          <w:bottom w:val="single" w:color="DED3C8" w:sz="4"/>
+          <w:right w:val="single" w:color="DED3C8" w:sz="4"/>
+          <w:insideH w:val="none" w:color="FFFFFF" w:sz="0"/>
+          <w:insideV w:val="none" w:color="FFFFFF" w:sz="0"/>
+        </w:tblBorders>
+      </w:tblPr>
+      <w:tblGrid>
+        <w:gridCol w:w="9026"/>
+      </w:tblGrid>
+      <w:tr>
+        <w:tc>
+          <w:tcPr>
+            <w:tcW w:type="dxa" w:w="9026"/>
+            <w:shd w:fill="FBF7F3" w:color="auto" w:val="clear"/>
+            <w:tcMar>
+              <w:top w:type="dxa" w:w="220"/>
+              <w:left w:type="dxa" w:w="240"/>
+              <w:bottom w:type="dxa" w:w="220"/>
+              <w:right w:type="dxa" w:w="240"/>
+            </w:tcMar>
+          </w:tcPr>
+          <w:p>
+            <w:pPr>
+              <w:spacing w:after="110" w:line="288"/>
+            </w:pPr>
+            <w:r>
+              <w:rPr>
+                <w:rFonts w:ascii="Calibri" w:cs="Calibri" w:eastAsia="Calibri" w:hAnsi="Calibri"/>
+                <w:color w:val="262626"/>
+                <w:sz w:val="21"/>
+                <w:szCs w:val="21"/>
+              </w:rPr>
+              <w:t xml:space="preserve">Pentru restaurante, magazine și companii.</w:t>
+            </w:r>
+          </w:p>
+          <w:p>
+            <w:pPr>
+              <w:spacing w:after="0" w:line="288"/>
+            </w:pPr>
+            <w:r>
+              <w:rPr>
+                <w:rFonts w:ascii="Calibri" w:cs="Calibri" w:eastAsia="Calibri" w:hAnsi="Calibri"/>
+                <w:color w:val="262626"/>
+                <w:sz w:val="21"/>
+                <w:szCs w:val="21"/>
+              </w:rPr>
+              <w:t xml:space="preserve"> </w:t>
+            </w:r>
+          </w:p>
+          <w:p>
+            <w:pPr>
+              <w:spacing w:after="110" w:line="288"/>
+            </w:pPr>
+            <w:r>
+              <w:rPr>
+                <w:rFonts w:ascii="Calibri" w:cs="Calibri" w:eastAsia="Calibri" w:hAnsi="Calibri"/>
+                <w:color w:val="262626"/>
+                <w:sz w:val="21"/>
+                <w:szCs w:val="21"/>
+              </w:rPr>
+              <w:t xml:space="preserve">Lucrăm cu parteneri care au nevoie de volum constant și de o poveste pe care să o poată spune clienților lor. Ce putem oferi:</w:t>
+            </w:r>
+          </w:p>
+          <w:p>
+            <w:pPr>
+              <w:spacing w:after="0" w:line="288"/>
+            </w:pPr>
+            <w:r>
+              <w:rPr>
+                <w:rFonts w:ascii="Calibri" w:cs="Calibri" w:eastAsia="Calibri" w:hAnsi="Calibri"/>
+                <w:color w:val="262626"/>
+                <w:sz w:val="21"/>
+                <w:szCs w:val="21"/>
+              </w:rPr>
+              <w:t xml:space="preserve"> </w:t>
+            </w:r>
+          </w:p>
+          <w:p>
+            <w:pPr>
+              <w:spacing w:after="110" w:line="288"/>
+            </w:pPr>
+            <w:r>
+              <w:rPr>
+                <w:rFonts w:ascii="Calibri" w:cs="Calibri" w:eastAsia="Calibri" w:hAnsi="Calibri"/>
+                <w:color w:val="262626"/>
+                <w:sz w:val="21"/>
+                <w:szCs w:val="21"/>
+              </w:rPr>
+              <w:t xml:space="preserve">· portofoliu de peste douăzeci de soiuri, românești și internaționale</w:t>
+            </w:r>
+          </w:p>
+          <w:p>
+            <w:pPr>
+              <w:spacing w:after="110" w:line="288"/>
+            </w:pPr>
+            <w:r>
+              <w:rPr>
+                <w:rFonts w:ascii="Calibri" w:cs="Calibri" w:eastAsia="Calibri" w:hAnsi="Calibri"/>
+                <w:color w:val="262626"/>
+                <w:sz w:val="21"/>
+                <w:szCs w:val="21"/>
+              </w:rPr>
+              <w:t xml:space="preserve">· game ecologice certificate — un argument tot mai căutat în carta de vinuri</w:t>
+            </w:r>
+          </w:p>
+          <w:p>
+            <w:pPr>
+              <w:spacing w:after="110" w:line="288"/>
+            </w:pPr>
+            <w:r>
+              <w:rPr>
+                <w:rFonts w:ascii="Calibri" w:cs="Calibri" w:eastAsia="Calibri" w:hAnsi="Calibri"/>
+                <w:color w:val="262626"/>
+                <w:sz w:val="21"/>
+                <w:szCs w:val="21"/>
+              </w:rPr>
+              <w:t xml:space="preserve">· îmbuteliere în sticlă și bag-in-box, în funcție de destinație</w:t>
+            </w:r>
+          </w:p>
+          <w:p>
+            <w:pPr>
+              <w:spacing w:after="110" w:line="288"/>
+            </w:pPr>
+            <w:r>
+              <w:rPr>
+                <w:rFonts w:ascii="Calibri" w:cs="Calibri" w:eastAsia="Calibri" w:hAnsi="Calibri"/>
+                <w:color w:val="262626"/>
+                <w:sz w:val="21"/>
+                <w:szCs w:val="21"/>
+              </w:rPr>
+              <w:t xml:space="preserve">· pachete cadou personalizate cu eticheta companiei, pentru sărbători și evenimente</w:t>
+            </w:r>
+          </w:p>
+          <w:p>
+            <w:pPr>
+              <w:spacing w:after="110" w:line="288"/>
+            </w:pPr>
+            <w:r>
+              <w:rPr>
+                <w:rFonts w:ascii="Calibri" w:cs="Calibri" w:eastAsia="Calibri" w:hAnsi="Calibri"/>
+                <w:color w:val="262626"/>
+                <w:sz w:val="21"/>
+                <w:szCs w:val="21"/>
+              </w:rPr>
+              <w:t xml:space="preserve">· livrare la o adresă sau la fiecare destinatar în parte</w:t>
+            </w:r>
+          </w:p>
+          <w:p>
+            <w:pPr>
+              <w:spacing w:after="0" w:line="288"/>
+            </w:pPr>
+            <w:r>
+              <w:rPr>
+                <w:rFonts w:ascii="Calibri" w:cs="Calibri" w:eastAsia="Calibri" w:hAnsi="Calibri"/>
+                <w:color w:val="262626"/>
+                <w:sz w:val="21"/>
+                <w:szCs w:val="21"/>
+              </w:rPr>
+              <w:t xml:space="preserve"> </w:t>
+            </w:r>
+          </w:p>
+          <w:p>
+            <w:pPr>
+              <w:spacing w:after="110" w:line="288"/>
+            </w:pPr>
+            <w:r>
+              <w:rPr>
+                <w:rFonts w:ascii="Calibri" w:cs="Calibri" w:eastAsia="Calibri" w:hAnsi="Calibri"/>
+                <w:color w:val="262626"/>
+                <w:sz w:val="21"/>
+                <w:szCs w:val="21"/>
+              </w:rPr>
+              <w:t xml:space="preserve">Spuneți-ne bugetul și numărul de pachete; revenim cu două-trei propuneri și cu prețurile de partener.</w:t>
+            </w:r>
+          </w:p>
+          <w:p>
+            <w:pPr>
+              <w:spacing w:after="0" w:line="288"/>
+            </w:pPr>
+            <w:r>
+              <w:rPr>
+                <w:rFonts w:ascii="Calibri" w:cs="Calibri" w:eastAsia="Calibri" w:hAnsi="Calibri"/>
+                <w:color w:val="262626"/>
+                <w:sz w:val="21"/>
+                <w:szCs w:val="21"/>
+              </w:rPr>
+              <w:t xml:space="preserve"> </w:t>
+            </w:r>
+          </w:p>
+          <w:p>
+            <w:pPr>
+              <w:spacing w:after="110" w:line="288"/>
+            </w:pPr>
+            <w:r>
+              <w:rPr>
+                <w:rFonts w:ascii="Calibri" w:cs="Calibri" w:eastAsia="Calibri" w:hAnsi="Calibri"/>
+                <w:color w:val="262626"/>
+                <w:sz w:val="21"/>
+                <w:szCs w:val="21"/>
+              </w:rPr>
+              <w:t xml:space="preserve">[EMAIL] · [TELEFON]</w:t>
+            </w:r>
+          </w:p>
+          <w:p>
+            <w:pPr>
+              <w:spacing w:after="0" w:line="288"/>
+            </w:pPr>
+            <w:r>
+              <w:rPr>
+                <w:rFonts w:ascii="Calibri" w:cs="Calibri" w:eastAsia="Calibri" w:hAnsi="Calibri"/>
+                <w:color w:val="262626"/>
+                <w:sz w:val="21"/>
+                <w:szCs w:val="21"/>
+              </w:rPr>
+              <w:t xml:space="preserve"> </w:t>
+            </w:r>
+          </w:p>
+          <w:p>
+            <w:pPr>
+              <w:spacing w:after="110" w:line="288"/>
+            </w:pPr>
+            <w:r>
+              <w:rPr>
+                <w:rFonts w:ascii="Calibri" w:cs="Calibri" w:eastAsia="Calibri" w:hAnsi="Calibri"/>
+                <w:color w:val="262626"/>
+                <w:sz w:val="21"/>
+                <w:szCs w:val="21"/>
+              </w:rPr>
+              <w:t xml:space="preserve">Consumă responsabil. 18+</w:t>
+            </w:r>
+          </w:p>
+        </w:tc>
+      </w:tr>
+    </w:tbl>
+    <w:p>
+      <w:pPr>
+        <w:spacing w:after="70" w:before="200"/>
+      </w:pPr>
+      <w:r>
+        <w:rPr>
+          <w:rFonts w:ascii="Calibri" w:cs="Calibri" w:eastAsia="Calibri" w:hAnsi="Calibri"/>
+          <w:b/>
+          <w:bCs/>
+          <w:color w:val="9A7B27"/>
+          <w:spacing w:val="30"/>
+          <w:sz w:val="16"/>
+          <w:szCs w:val="16"/>
+        </w:rPr>
+        <w:t xml:space="preserve">PRODUCȚIE</w:t>
+      </w:r>
+    </w:p>
+    <w:p>
+      <w:pPr>
+        <w:spacing w:after="90" w:line="276"/>
+      </w:pPr>
+      <w:r>
+        <w:rPr>
+          <w:rFonts w:ascii="Calibri" w:cs="Calibri" w:eastAsia="Calibri" w:hAnsi="Calibri"/>
+          <w:b/>
+          <w:bCs/>
+          <w:color w:val="5E1026"/>
+          <w:sz w:val="19"/>
+          <w:szCs w:val="19"/>
+        </w:rPr>
+        <w:t xml:space="preserve">Vizual — </w:t>
+      </w:r>
+      <w:r>
+        <w:rPr>
+          <w:rFonts w:ascii="Calibri" w:cs="Calibri" w:eastAsia="Calibri" w:hAnsi="Calibri"/>
+          <w:color w:val="262626"/>
+          <w:sz w:val="19"/>
+          <w:szCs w:val="19"/>
+        </w:rPr>
+        <w:t xml:space="preserve">Pachet cadou finalizat, cu etichetă personalizată, lângă o cutie de lemn deschisă. Alternativ: raftul unui restaurant partener.</w:t>
+      </w:r>
+    </w:p>
+    <w:p>
+      <w:pPr>
+        <w:spacing w:after="90" w:line="276"/>
+      </w:pPr>
+      <w:r>
+        <w:rPr>
+          <w:rFonts w:ascii="Calibri" w:cs="Calibri" w:eastAsia="Calibri" w:hAnsi="Calibri"/>
+          <w:b/>
+          <w:bCs/>
+          <w:color w:val="5E1026"/>
+          <w:sz w:val="19"/>
+          <w:szCs w:val="19"/>
+        </w:rPr>
+        <w:t xml:space="preserve">Buton / CTA — </w:t>
+      </w:r>
+      <w:r>
+        <w:rPr>
+          <w:rFonts w:ascii="Calibri" w:cs="Calibri" w:eastAsia="Calibri" w:hAnsi="Calibri"/>
+          <w:color w:val="262626"/>
+          <w:sz w:val="19"/>
+          <w:szCs w:val="19"/>
+        </w:rPr>
+        <w:t xml:space="preserve">Buton „Trimite mesaj". Promovați această postare separat, țintit pe titluri de funcție: administrator, achiziții, HR, office manager.</w:t>
+      </w:r>
+    </w:p>
+    <w:p>
+      <w:pPr>
+        <w:spacing w:after="90" w:line="276"/>
+      </w:pPr>
+      <w:r>
+        <w:rPr>
+          <w:rFonts w:ascii="Calibri" w:cs="Calibri" w:eastAsia="Calibri" w:hAnsi="Calibri"/>
+          <w:b/>
+          <w:bCs/>
+          <w:color w:val="5E1026"/>
+          <w:sz w:val="19"/>
+          <w:szCs w:val="19"/>
+        </w:rPr>
+        <w:t xml:space="preserve">Hashtag-uri — </w:t>
+      </w:r>
+      <w:r>
+        <w:rPr>
+          <w:rFonts w:ascii="Calibri" w:cs="Calibri" w:eastAsia="Calibri" w:hAnsi="Calibri"/>
+          <w:color w:val="262626"/>
+          <w:sz w:val="19"/>
+          <w:szCs w:val="19"/>
+        </w:rPr>
+        <w:t xml:space="preserve">#CadouriCorporate #HoReCa #Parteneriate #VinRomanesc #CrameleOdobesti</w:t>
+      </w:r>
+    </w:p>
+    <w:p>
+      <w:pPr>
+        <w:pBdr>
+          <w:left w:val="single" w:color="9A7B27" w:sz="10" w:space="10"/>
+        </w:pBdr>
+        <w:spacing w:after="140" w:before="120" w:line="276"/>
+        <w:ind w:left="200"/>
+      </w:pPr>
+      <w:r>
+        <w:rPr>
+          <w:rFonts w:ascii="Calibri" w:cs="Calibri" w:eastAsia="Calibri" w:hAnsi="Calibri"/>
+          <w:i/>
+          <w:iCs/>
+          <w:color w:val="6E6E6E"/>
+          <w:sz w:val="19"/>
+          <w:szCs w:val="19"/>
+        </w:rPr>
+        <w:t xml:space="preserve">Cadourile de firmă se decid în septembrie–octombrie, nu în decembrie. Publicați această postare devreme.</w:t>
+      </w:r>
+    </w:p>
+    <w:p>
+      <w:pPr>
+        <w:pStyle w:val="Heading2"/>
+        <w:keepNext/>
+        <w:spacing w:after="60" w:before="380"/>
+      </w:pPr>
+      <w:r>
+        <w:rPr>
+          <w:rFonts w:ascii="Georgia" w:cs="Georgia" w:eastAsia="Georgia" w:hAnsi="Georgia"/>
+          <w:b/>
+          <w:bCs/>
+          <w:color w:val="5E1026"/>
+          <w:sz w:val="25"/>
+          <w:szCs w:val="25"/>
+        </w:rPr>
+        <w:t xml:space="preserve">13. Pachetul de descoperire — oferta de conversie</w:t>
       </w:r>
       <w:r>
         <w:rPr>
@@ -5766,7 +6242,7 @@
                 <w:sz w:val="18"/>
                 <w:szCs w:val="18"/>
               </w:rPr>
-              <w:t xml:space="preserve">8</w:t>
+              <w:t xml:space="preserve">9</w:t>
             </w:r>
           </w:p>
         </w:tc>
@@ -5939,7 +6415,7 @@
                 <w:sz w:val="18"/>
                 <w:szCs w:val="18"/>
               </w:rPr>
-              <w:t xml:space="preserve">Omnia — povestea numelui</w:t>
+              <w:t xml:space="preserve">Ne doare pe noi capul — metoda</w:t>
             </w:r>
           </w:p>
         </w:tc>
@@ -5967,7 +6443,7 @@
                 <w:sz w:val="18"/>
                 <w:szCs w:val="18"/>
               </w:rPr>
-              <w:t xml:space="preserve">19:00–21:00</w:t>
+              <w:t xml:space="preserve">18:00–20:00</w:t>
             </w:r>
           </w:p>
         </w:tc>
@@ -5995,7 +6471,7 @@
                 <w:sz w:val="18"/>
                 <w:szCs w:val="18"/>
               </w:rPr>
-              <w:t xml:space="preserve">Nu</w:t>
+              <w:t xml:space="preserve">Da</w:t>
             </w:r>
           </w:p>
         </w:tc>
@@ -6201,7 +6677,7 @@
                 <w:sz w:val="18"/>
                 <w:szCs w:val="18"/>
               </w:rPr>
-              <w:t xml:space="preserve">6</w:t>
+              <w:t xml:space="preserve">7</w:t>
             </w:r>
           </w:p>
         </w:tc>
@@ -6346,7 +6822,7 @@
                 <w:sz w:val="18"/>
                 <w:szCs w:val="18"/>
               </w:rPr>
-              <w:t xml:space="preserve">5</w:t>
+              <w:t xml:space="preserve">6</w:t>
             </w:r>
           </w:p>
         </w:tc>
@@ -6491,7 +6967,7 @@
                 <w:sz w:val="18"/>
                 <w:szCs w:val="18"/>
               </w:rPr>
-              <w:t xml:space="preserve">10</w:t>
+              <w:t xml:space="preserve">5</w:t>
             </w:r>
           </w:p>
         </w:tc>
@@ -6519,7 +6995,7 @@
                 <w:sz w:val="18"/>
                 <w:szCs w:val="18"/>
               </w:rPr>
-              <w:t xml:space="preserve">Glia — Șarbă</w:t>
+              <w:t xml:space="preserve">Omnia — povestea numelui</w:t>
             </w:r>
           </w:p>
         </w:tc>
@@ -6547,7 +7023,7 @@
                 <w:sz w:val="18"/>
                 <w:szCs w:val="18"/>
               </w:rPr>
-              <w:t xml:space="preserve">18:00–20:00</w:t>
+              <w:t xml:space="preserve">19:00–21:00</w:t>
             </w:r>
           </w:p>
         </w:tc>
@@ -6636,7 +7112,7 @@
                 <w:sz w:val="18"/>
                 <w:szCs w:val="18"/>
               </w:rPr>
-              <w:t xml:space="preserve">7</w:t>
+              <w:t xml:space="preserve">11</w:t>
             </w:r>
           </w:p>
         </w:tc>
@@ -6664,7 +7140,7 @@
                 <w:sz w:val="18"/>
                 <w:szCs w:val="18"/>
               </w:rPr>
-              <w:t xml:space="preserve">Senator Private Collection</w:t>
+              <w:t xml:space="preserve">Glia — Șarbă</w:t>
             </w:r>
           </w:p>
         </w:tc>
@@ -6720,7 +7196,7 @@
                 <w:sz w:val="18"/>
                 <w:szCs w:val="18"/>
               </w:rPr>
-              <w:t xml:space="preserve">Opțional</w:t>
+              <w:t xml:space="preserve">Nu</w:t>
             </w:r>
           </w:p>
         </w:tc>
@@ -6753,7 +7229,7 @@
                 <w:sz w:val="18"/>
                 <w:szCs w:val="18"/>
               </w:rPr>
-              <w:t xml:space="preserve">Ziua 18, Vin</w:t>
+              <w:t xml:space="preserve">Ziua 17, Joi</w:t>
             </w:r>
           </w:p>
         </w:tc>
@@ -6781,7 +7257,7 @@
                 <w:sz w:val="18"/>
                 <w:szCs w:val="18"/>
               </w:rPr>
-              <w:t xml:space="preserve">11</w:t>
+              <w:t xml:space="preserve">8</w:t>
             </w:r>
           </w:p>
         </w:tc>
@@ -6809,7 +7285,7 @@
                 <w:sz w:val="18"/>
                 <w:szCs w:val="18"/>
               </w:rPr>
-              <w:t xml:space="preserve">Parteneriate și cadouri de firmă</w:t>
+              <w:t xml:space="preserve">Senator Private Collection</w:t>
             </w:r>
           </w:p>
         </w:tc>
@@ -6837,7 +7313,7 @@
                 <w:sz w:val="18"/>
                 <w:szCs w:val="18"/>
               </w:rPr>
-              <w:t xml:space="preserve">10:00–12:00</w:t>
+              <w:t xml:space="preserve">18:00–20:00</w:t>
             </w:r>
           </w:p>
         </w:tc>
@@ -6865,7 +7341,7 @@
                 <w:sz w:val="18"/>
                 <w:szCs w:val="18"/>
               </w:rPr>
-              <w:t xml:space="preserve">Da (țintit)</w:t>
+              <w:t xml:space="preserve">Opțional</w:t>
             </w:r>
           </w:p>
         </w:tc>
@@ -6898,7 +7374,7 @@
                 <w:sz w:val="18"/>
                 <w:szCs w:val="18"/>
               </w:rPr>
-              <w:t xml:space="preserve">Ziua 20, Dum</w:t>
+              <w:t xml:space="preserve">Ziua 19, Sâm</w:t>
             </w:r>
           </w:p>
         </w:tc>
@@ -6926,7 +7402,7 @@
                 <w:sz w:val="18"/>
                 <w:szCs w:val="18"/>
               </w:rPr>
-              <w:t xml:space="preserve">9</w:t>
+              <w:t xml:space="preserve">12</w:t>
             </w:r>
           </w:p>
         </w:tc>
@@ -6954,7 +7430,7 @@
                 <w:sz w:val="18"/>
                 <w:szCs w:val="18"/>
               </w:rPr>
-              <w:t xml:space="preserve">Hereditas — ce moștenim</w:t>
+              <w:t xml:space="preserve">Parteneriate și cadouri de firmă</w:t>
             </w:r>
           </w:p>
         </w:tc>
@@ -6982,7 +7458,7 @@
                 <w:sz w:val="18"/>
                 <w:szCs w:val="18"/>
               </w:rPr>
-              <w:t xml:space="preserve">11:00–13:00</w:t>
+              <w:t xml:space="preserve">10:00–12:00</w:t>
             </w:r>
           </w:p>
         </w:tc>
@@ -7010,7 +7486,7 @@
                 <w:sz w:val="18"/>
                 <w:szCs w:val="18"/>
               </w:rPr>
-              <w:t xml:space="preserve">Nu</w:t>
+              <w:t xml:space="preserve">Da (țintit)</w:t>
             </w:r>
           </w:p>
         </w:tc>
@@ -7043,7 +7519,7 @@
                 <w:sz w:val="18"/>
                 <w:szCs w:val="18"/>
               </w:rPr>
-              <w:t xml:space="preserve">Ziua 21, Lun</w:t>
+              <w:t xml:space="preserve">Ziua 20, Dum</w:t>
             </w:r>
           </w:p>
         </w:tc>
@@ -7071,7 +7547,152 @@
                 <w:sz w:val="18"/>
                 <w:szCs w:val="18"/>
               </w:rPr>
-              <w:t xml:space="preserve">12</w:t>
+              <w:t xml:space="preserve">10</w:t>
+            </w:r>
+          </w:p>
+        </w:tc>
+        <w:tc>
+          <w:tcPr>
+            <w:tcW w:type="dxa" w:w="3546"/>
+            <w:shd w:fill="FFFFFF" w:color="auto" w:val="clear"/>
+            <w:tcMar>
+              <w:top w:type="dxa" w:w="100"/>
+              <w:left w:type="dxa" w:w="130"/>
+              <w:bottom w:type="dxa" w:w="100"/>
+              <w:right w:type="dxa" w:w="130"/>
+            </w:tcMar>
+          </w:tcPr>
+          <w:p>
+            <w:pPr>
+              <w:spacing w:after="0" w:line="264"/>
+            </w:pPr>
+            <w:r>
+              <w:rPr>
+                <w:rFonts w:ascii="Calibri" w:cs="Calibri" w:eastAsia="Calibri" w:hAnsi="Calibri"/>
+                <w:b w:val="false"/>
+                <w:bCs w:val="false"/>
+                <w:color w:val="262626"/>
+                <w:sz w:val="18"/>
+                <w:szCs w:val="18"/>
+              </w:rPr>
+              <w:t xml:space="preserve">Hereditas — ce moștenim</w:t>
+            </w:r>
+          </w:p>
+        </w:tc>
+        <w:tc>
+          <w:tcPr>
+            <w:tcW w:type="dxa" w:w="1550"/>
+            <w:shd w:fill="FFFFFF" w:color="auto" w:val="clear"/>
+            <w:tcMar>
+              <w:top w:type="dxa" w:w="100"/>
+              <w:left w:type="dxa" w:w="130"/>
+              <w:bottom w:type="dxa" w:w="100"/>
+              <w:right w:type="dxa" w:w="130"/>
+            </w:tcMar>
+          </w:tcPr>
+          <w:p>
+            <w:pPr>
+              <w:spacing w:after="0" w:line="264"/>
+            </w:pPr>
+            <w:r>
+              <w:rPr>
+                <w:rFonts w:ascii="Calibri" w:cs="Calibri" w:eastAsia="Calibri" w:hAnsi="Calibri"/>
+                <w:b w:val="false"/>
+                <w:bCs w:val="false"/>
+                <w:color w:val="262626"/>
+                <w:sz w:val="18"/>
+                <w:szCs w:val="18"/>
+              </w:rPr>
+              <w:t xml:space="preserve">11:00–13:00</w:t>
+            </w:r>
+          </w:p>
+        </w:tc>
+        <w:tc>
+          <w:tcPr>
+            <w:tcW w:type="dxa" w:w="1900"/>
+            <w:shd w:fill="FFFFFF" w:color="auto" w:val="clear"/>
+            <w:tcMar>
+              <w:top w:type="dxa" w:w="100"/>
+              <w:left w:type="dxa" w:w="130"/>
+              <w:bottom w:type="dxa" w:w="100"/>
+              <w:right w:type="dxa" w:w="130"/>
+            </w:tcMar>
+          </w:tcPr>
+          <w:p>
+            <w:pPr>
+              <w:spacing w:after="0" w:line="264"/>
+            </w:pPr>
+            <w:r>
+              <w:rPr>
+                <w:rFonts w:ascii="Calibri" w:cs="Calibri" w:eastAsia="Calibri" w:hAnsi="Calibri"/>
+                <w:b w:val="false"/>
+                <w:bCs w:val="false"/>
+                <w:color w:val="262626"/>
+                <w:sz w:val="18"/>
+                <w:szCs w:val="18"/>
+              </w:rPr>
+              <w:t xml:space="preserve">Nu</w:t>
+            </w:r>
+          </w:p>
+        </w:tc>
+      </w:tr>
+      <w:tr>
+        <w:trPr>
+          <w:tblHeader w:val="false"/>
+        </w:trPr>
+        <w:tc>
+          <w:tcPr>
+            <w:tcW w:type="dxa" w:w="1250"/>
+            <w:shd w:fill="FFFFFF" w:color="auto" w:val="clear"/>
+            <w:tcMar>
+              <w:top w:type="dxa" w:w="100"/>
+              <w:left w:type="dxa" w:w="130"/>
+              <w:bottom w:type="dxa" w:w="100"/>
+              <w:right w:type="dxa" w:w="130"/>
+            </w:tcMar>
+          </w:tcPr>
+          <w:p>
+            <w:pPr>
+              <w:spacing w:after="0" w:line="264"/>
+            </w:pPr>
+            <w:r>
+              <w:rPr>
+                <w:rFonts w:ascii="Calibri" w:cs="Calibri" w:eastAsia="Calibri" w:hAnsi="Calibri"/>
+                <w:b w:val="false"/>
+                <w:bCs w:val="false"/>
+                <w:color w:val="262626"/>
+                <w:sz w:val="18"/>
+                <w:szCs w:val="18"/>
+              </w:rPr>
+              <w:t xml:space="preserve">Ziua 22, Mar</w:t>
+            </w:r>
+          </w:p>
+        </w:tc>
+        <w:tc>
+          <w:tcPr>
+            <w:tcW w:type="dxa" w:w="780"/>
+            <w:shd w:fill="FFFFFF" w:color="auto" w:val="clear"/>
+            <w:tcMar>
+              <w:top w:type="dxa" w:w="100"/>
+              <w:left w:type="dxa" w:w="130"/>
+              <w:bottom w:type="dxa" w:w="100"/>
+              <w:right w:type="dxa" w:w="130"/>
+            </w:tcMar>
+          </w:tcPr>
+          <w:p>
+            <w:pPr>
+              <w:spacing w:after="0" w:line="264"/>
+            </w:pPr>
+            <w:r>
+              <w:rPr>
+                <w:rFonts w:ascii="Calibri" w:cs="Calibri" w:eastAsia="Calibri" w:hAnsi="Calibri"/>
+                <w:b w:val="false"/>
+                <w:bCs w:val="false"/>
+                <w:color w:val="262626"/>
+                <w:sz w:val="18"/>
+                <w:szCs w:val="18"/>
+              </w:rPr>
+              <w:t xml:space="preserve">13</w:t>
             </w:r>
           </w:p>
         </w:tc>
@@ -8181,6 +8802,44 @@
           <w:szCs w:val="21"/>
         </w:rPr>
         <w:t xml:space="preserve">Afirmațiile privind caracterul ecologic trebuie să corespundă certificării valabile la data publicării.</w:t>
+      </w:r>
+    </w:p>
+    <w:p>
+      <w:pPr>
+        <w:pStyle w:val="ListParagraph"/>
+        <w:numPr>
+          <w:ilvl w:val="0"/>
+          <w:numId w:val="2"/>
+        </w:numPr>
+        <w:spacing w:after="90" w:line="276"/>
+      </w:pPr>
+      <w:r>
+        <w:rPr>
+          <w:rFonts w:ascii="Calibri" w:cs="Calibri" w:eastAsia="Calibri" w:hAnsi="Calibri"/>
+          <w:color w:val="262626"/>
+          <w:sz w:val="21"/>
+          <w:szCs w:val="21"/>
+        </w:rPr>
+        <w:t xml:space="preserve">Nicio mențiune de sănătate. Regulamentul european privind mențiunile nutriționale și de sănătate interzice complet mențiunile de sănătate pe băuturile cu peste 1,2% alcool. Intră aici „cu aport de sănătate", „sănătos", „face bine la inimă", „antioxidanți", dar și formulările indirecte de tipul „nu te doare capul", pentru că promit absența unui efect advers.</w:t>
+      </w:r>
+    </w:p>
+    <w:p>
+      <w:pPr>
+        <w:pStyle w:val="ListParagraph"/>
+        <w:numPr>
+          <w:ilvl w:val="0"/>
+          <w:numId w:val="2"/>
+        </w:numPr>
+        <w:spacing w:after="90" w:line="276"/>
+      </w:pPr>
+      <w:r>
+        <w:rPr>
+          <w:rFonts w:ascii="Calibri" w:cs="Calibri" w:eastAsia="Calibri" w:hAnsi="Calibri"/>
+          <w:color w:val="262626"/>
+          <w:sz w:val="21"/>
+          <w:szCs w:val="21"/>
+        </w:rPr>
+        <w:t xml:space="preserve">Descrieți în schimb metoda, nu efectul. „Stropit minim, cu macerate de plante, fără insecticide și fără îngrășăminte de sinteză" este permis, verificabil și spune, pentru cititorul atent, exact același lucru.</w:t>
       </w:r>
     </w:p>
     <w:p>

</xml_diff>